<commit_message>
Update pricing tiers for video analysis jobs
Modify VisionTrack-Proposal.html and .docx to introduce tiered pricing for video analysis jobs, with distinct prices for short, standard, and long durations, and update the public versions of these files.

Replit-Commit-Author: Agent
Replit-Commit-Session-Id: e5be5380-7ed6-464d-a7de-b2f0af8d3ecf
Replit-Commit-Checkpoint-Type: full_checkpoint
Replit-Commit-Event-Id: 119214d7-4f9e-4711-be53-67b332bcee50
Replit-Commit-Screenshot-Url: https://storage.googleapis.com/screenshot-production-us-central1/40005695-766b-4df9-801e-05785cb39d6d/e5be5380-7ed6-464d-a7de-b2f0af8d3ecf/ZcJQ5xo
Replit-Helium-Checkpoint-Created: true
</commit_message>
<xml_diff>
--- a/VisionTrack-Proposal.docx
+++ b/VisionTrack-Proposal.docx
@@ -24,7 +24,6 @@
       </w:pPr>
       <w:r>
         <w:rPr>
-          <w:rFonts w:ascii="Calibri" w:cs="Calibri" w:eastAsia="Calibri" w:hAnsi="Calibri"/>
           <w:b/>
           <w:bCs/>
           <w:color w:val="FFFFFF"/>
@@ -40,7 +39,6 @@
       </w:pPr>
       <w:r>
         <w:rPr>
-          <w:rFonts w:ascii="Calibri" w:cs="Calibri" w:eastAsia="Calibri" w:hAnsi="Calibri"/>
           <w:b/>
           <w:bCs/>
           <w:color w:val="00C9A7"/>
@@ -258,11 +256,6 @@
       <w:pPr>
         <w:pStyle w:val="Heading1"/>
         <w:spacing w:after="120" w:before="400"/>
-        <w:rPr>
-          <w:b/>
-          <w:bCs/>
-          <w:color w:val="0D1B2A"/>
-        </w:rPr>
       </w:pPr>
       <w:r>
         <w:t xml:space="preserve">Executive Summary</w:t>
@@ -290,9 +283,6 @@
       <w:pPr>
         <w:pStyle w:val="Heading2"/>
         <w:spacing w:after="80" w:before="320"/>
-        <w:rPr>
-          <w:color w:val="0D1B2A"/>
-        </w:rPr>
       </w:pPr>
       <w:r>
         <w:t xml:space="preserve">Key Capabilities</w:t>
@@ -472,11 +462,6 @@
       <w:pPr>
         <w:pStyle w:val="Heading1"/>
         <w:spacing w:after="120" w:before="400"/>
-        <w:rPr>
-          <w:b/>
-          <w:bCs/>
-          <w:color w:val="0D1B2A"/>
-        </w:rPr>
       </w:pPr>
       <w:r>
         <w:t xml:space="preserve">Analysis Pipeline</w:t>
@@ -683,11 +668,6 @@
       <w:pPr>
         <w:pStyle w:val="Heading1"/>
         <w:spacing w:after="120" w:before="400"/>
-        <w:rPr>
-          <w:b/>
-          <w:bCs/>
-          <w:color w:val="0D1B2A"/>
-        </w:rPr>
       </w:pPr>
       <w:r>
         <w:t xml:space="preserve">Six-Sheet Analytics Workbook</w:t>
@@ -733,7 +713,6 @@
         <w:tc>
           <w:tcPr>
             <w:tcW w:type="pct" w:w="25%"/>
-            <w:gridSpan w:val="1"/>
             <w:shd w:fill="0D1B2A" w:val="clear"/>
             <w:tcMar>
               <w:top w:type="dxa" w:w="80"/>
@@ -758,7 +737,6 @@
         <w:tc>
           <w:tcPr>
             <w:tcW w:type="pct" w:w="20%"/>
-            <w:gridSpan w:val="1"/>
             <w:shd w:fill="0D1B2A" w:val="clear"/>
             <w:tcMar>
               <w:top w:type="dxa" w:w="80"/>
@@ -783,7 +761,6 @@
         <w:tc>
           <w:tcPr>
             <w:tcW w:type="pct" w:w="55%"/>
-            <w:gridSpan w:val="1"/>
             <w:shd w:fill="0D1B2A" w:val="clear"/>
             <w:tcMar>
               <w:top w:type="dxa" w:w="80"/>
@@ -810,7 +787,6 @@
         <w:tc>
           <w:tcPr>
             <w:tcW w:type="pct" w:w="25%"/>
-            <w:gridSpan w:val="1"/>
             <w:shd w:fill="FFFFFF" w:val="clear"/>
             <w:tcMar>
               <w:top w:type="dxa" w:w="80"/>
@@ -835,7 +811,6 @@
         <w:tc>
           <w:tcPr>
             <w:tcW w:type="pct" w:w="20%"/>
-            <w:gridSpan w:val="1"/>
             <w:shd w:fill="DBEAFE" w:val="clear"/>
             <w:tcMar>
               <w:top w:type="dxa" w:w="80"/>
@@ -860,7 +835,6 @@
         <w:tc>
           <w:tcPr>
             <w:tcW w:type="pct" w:w="55%"/>
-            <w:gridSpan w:val="1"/>
             <w:shd w:fill="FFFFFF" w:val="clear"/>
             <w:tcMar>
               <w:top w:type="dxa" w:w="80"/>
@@ -887,7 +861,6 @@
         <w:tc>
           <w:tcPr>
             <w:tcW w:type="pct" w:w="25%"/>
-            <w:gridSpan w:val="1"/>
             <w:shd w:fill="FFFFFF" w:val="clear"/>
             <w:tcMar>
               <w:top w:type="dxa" w:w="80"/>
@@ -912,7 +885,6 @@
         <w:tc>
           <w:tcPr>
             <w:tcW w:type="pct" w:w="20%"/>
-            <w:gridSpan w:val="1"/>
             <w:shd w:fill="D1FAE5" w:val="clear"/>
             <w:tcMar>
               <w:top w:type="dxa" w:w="80"/>
@@ -937,7 +909,6 @@
         <w:tc>
           <w:tcPr>
             <w:tcW w:type="pct" w:w="55%"/>
-            <w:gridSpan w:val="1"/>
             <w:shd w:fill="FFFFFF" w:val="clear"/>
             <w:tcMar>
               <w:top w:type="dxa" w:w="80"/>
@@ -964,7 +935,6 @@
         <w:tc>
           <w:tcPr>
             <w:tcW w:type="pct" w:w="25%"/>
-            <w:gridSpan w:val="1"/>
             <w:shd w:fill="FFFFFF" w:val="clear"/>
             <w:tcMar>
               <w:top w:type="dxa" w:w="80"/>
@@ -989,7 +959,6 @@
         <w:tc>
           <w:tcPr>
             <w:tcW w:type="pct" w:w="20%"/>
-            <w:gridSpan w:val="1"/>
             <w:shd w:fill="FEF3C7" w:val="clear"/>
             <w:tcMar>
               <w:top w:type="dxa" w:w="80"/>
@@ -1014,7 +983,6 @@
         <w:tc>
           <w:tcPr>
             <w:tcW w:type="pct" w:w="55%"/>
-            <w:gridSpan w:val="1"/>
             <w:shd w:fill="FFFFFF" w:val="clear"/>
             <w:tcMar>
               <w:top w:type="dxa" w:w="80"/>
@@ -1041,7 +1009,6 @@
         <w:tc>
           <w:tcPr>
             <w:tcW w:type="pct" w:w="25%"/>
-            <w:gridSpan w:val="1"/>
             <w:shd w:fill="FFFFFF" w:val="clear"/>
             <w:tcMar>
               <w:top w:type="dxa" w:w="80"/>
@@ -1066,7 +1033,6 @@
         <w:tc>
           <w:tcPr>
             <w:tcW w:type="pct" w:w="20%"/>
-            <w:gridSpan w:val="1"/>
             <w:shd w:fill="EDE9FE" w:val="clear"/>
             <w:tcMar>
               <w:top w:type="dxa" w:w="80"/>
@@ -1091,7 +1057,6 @@
         <w:tc>
           <w:tcPr>
             <w:tcW w:type="pct" w:w="55%"/>
-            <w:gridSpan w:val="1"/>
             <w:shd w:fill="FFFFFF" w:val="clear"/>
             <w:tcMar>
               <w:top w:type="dxa" w:w="80"/>
@@ -1118,7 +1083,6 @@
         <w:tc>
           <w:tcPr>
             <w:tcW w:type="pct" w:w="25%"/>
-            <w:gridSpan w:val="1"/>
             <w:shd w:fill="FFFFFF" w:val="clear"/>
             <w:tcMar>
               <w:top w:type="dxa" w:w="80"/>
@@ -1143,7 +1107,6 @@
         <w:tc>
           <w:tcPr>
             <w:tcW w:type="pct" w:w="20%"/>
-            <w:gridSpan w:val="1"/>
             <w:shd w:fill="FEE2E2" w:val="clear"/>
             <w:tcMar>
               <w:top w:type="dxa" w:w="80"/>
@@ -1168,7 +1131,6 @@
         <w:tc>
           <w:tcPr>
             <w:tcW w:type="pct" w:w="55%"/>
-            <w:gridSpan w:val="1"/>
             <w:shd w:fill="FFFFFF" w:val="clear"/>
             <w:tcMar>
               <w:top w:type="dxa" w:w="80"/>
@@ -1195,7 +1157,6 @@
         <w:tc>
           <w:tcPr>
             <w:tcW w:type="pct" w:w="25%"/>
-            <w:gridSpan w:val="1"/>
             <w:shd w:fill="FFFFFF" w:val="clear"/>
             <w:tcMar>
               <w:top w:type="dxa" w:w="80"/>
@@ -1220,7 +1181,6 @@
         <w:tc>
           <w:tcPr>
             <w:tcW w:type="pct" w:w="20%"/>
-            <w:gridSpan w:val="1"/>
             <w:shd w:fill="CCFBF1" w:val="clear"/>
             <w:tcMar>
               <w:top w:type="dxa" w:w="80"/>
@@ -1245,7 +1205,6 @@
         <w:tc>
           <w:tcPr>
             <w:tcW w:type="pct" w:w="55%"/>
-            <w:gridSpan w:val="1"/>
             <w:shd w:fill="FFFFFF" w:val="clear"/>
             <w:tcMar>
               <w:top w:type="dxa" w:w="80"/>
@@ -1299,11 +1258,6 @@
       <w:pPr>
         <w:pStyle w:val="Heading1"/>
         <w:spacing w:after="120" w:before="400"/>
-        <w:rPr>
-          <w:b/>
-          <w:bCs/>
-          <w:color w:val="0D1B2A"/>
-        </w:rPr>
       </w:pPr>
       <w:r>
         <w:t xml:space="preserve">Configurable Detection Zones</w:t>
@@ -1443,11 +1397,6 @@
       <w:pPr>
         <w:pStyle w:val="Heading1"/>
         <w:spacing w:after="120" w:before="400"/>
-        <w:rPr>
-          <w:b/>
-          <w:bCs/>
-          <w:color w:val="0D1B2A"/>
-        </w:rPr>
       </w:pPr>
       <w:r>
         <w:t xml:space="preserve">Technology Stack</w:t>
@@ -1480,7 +1429,6 @@
         <w:tc>
           <w:tcPr>
             <w:tcW w:type="pct" w:w="25%"/>
-            <w:gridSpan w:val="1"/>
             <w:shd w:fill="0D1B2A" w:val="clear"/>
             <w:tcMar>
               <w:top w:type="dxa" w:w="80"/>
@@ -1505,7 +1453,6 @@
         <w:tc>
           <w:tcPr>
             <w:tcW w:type="pct" w:w="35%"/>
-            <w:gridSpan w:val="1"/>
             <w:shd w:fill="0D1B2A" w:val="clear"/>
             <w:tcMar>
               <w:top w:type="dxa" w:w="80"/>
@@ -1530,7 +1477,6 @@
         <w:tc>
           <w:tcPr>
             <w:tcW w:type="pct" w:w="40%"/>
-            <w:gridSpan w:val="1"/>
             <w:shd w:fill="0D1B2A" w:val="clear"/>
             <w:tcMar>
               <w:top w:type="dxa" w:w="80"/>
@@ -1557,7 +1503,6 @@
         <w:tc>
           <w:tcPr>
             <w:tcW w:type="pct" w:w="25%"/>
-            <w:gridSpan w:val="1"/>
             <w:shd w:fill="FFFFFF" w:val="clear"/>
             <w:tcMar>
               <w:top w:type="dxa" w:w="80"/>
@@ -1582,7 +1527,6 @@
         <w:tc>
           <w:tcPr>
             <w:tcW w:type="pct" w:w="35%"/>
-            <w:gridSpan w:val="1"/>
             <w:shd w:fill="FFFFFF" w:val="clear"/>
             <w:tcMar>
               <w:top w:type="dxa" w:w="80"/>
@@ -1607,7 +1551,6 @@
         <w:tc>
           <w:tcPr>
             <w:tcW w:type="pct" w:w="40%"/>
-            <w:gridSpan w:val="1"/>
             <w:shd w:fill="FFFFFF" w:val="clear"/>
             <w:tcMar>
               <w:top w:type="dxa" w:w="80"/>
@@ -1634,7 +1577,6 @@
         <w:tc>
           <w:tcPr>
             <w:tcW w:type="pct" w:w="25%"/>
-            <w:gridSpan w:val="1"/>
             <w:shd w:fill="FFFFFF" w:val="clear"/>
             <w:tcMar>
               <w:top w:type="dxa" w:w="80"/>
@@ -1659,7 +1601,6 @@
         <w:tc>
           <w:tcPr>
             <w:tcW w:type="pct" w:w="35%"/>
-            <w:gridSpan w:val="1"/>
             <w:shd w:fill="FFFFFF" w:val="clear"/>
             <w:tcMar>
               <w:top w:type="dxa" w:w="80"/>
@@ -1684,7 +1625,6 @@
         <w:tc>
           <w:tcPr>
             <w:tcW w:type="pct" w:w="40%"/>
-            <w:gridSpan w:val="1"/>
             <w:shd w:fill="FFFFFF" w:val="clear"/>
             <w:tcMar>
               <w:top w:type="dxa" w:w="80"/>
@@ -1711,7 +1651,6 @@
         <w:tc>
           <w:tcPr>
             <w:tcW w:type="pct" w:w="25%"/>
-            <w:gridSpan w:val="1"/>
             <w:shd w:fill="FFFFFF" w:val="clear"/>
             <w:tcMar>
               <w:top w:type="dxa" w:w="80"/>
@@ -1736,7 +1675,6 @@
         <w:tc>
           <w:tcPr>
             <w:tcW w:type="pct" w:w="35%"/>
-            <w:gridSpan w:val="1"/>
             <w:shd w:fill="FFFFFF" w:val="clear"/>
             <w:tcMar>
               <w:top w:type="dxa" w:w="80"/>
@@ -1761,7 +1699,6 @@
         <w:tc>
           <w:tcPr>
             <w:tcW w:type="pct" w:w="40%"/>
-            <w:gridSpan w:val="1"/>
             <w:shd w:fill="FFFFFF" w:val="clear"/>
             <w:tcMar>
               <w:top w:type="dxa" w:w="80"/>
@@ -1788,7 +1725,6 @@
         <w:tc>
           <w:tcPr>
             <w:tcW w:type="pct" w:w="25%"/>
-            <w:gridSpan w:val="1"/>
             <w:shd w:fill="FFFFFF" w:val="clear"/>
             <w:tcMar>
               <w:top w:type="dxa" w:w="80"/>
@@ -1813,7 +1749,6 @@
         <w:tc>
           <w:tcPr>
             <w:tcW w:type="pct" w:w="35%"/>
-            <w:gridSpan w:val="1"/>
             <w:shd w:fill="FFFFFF" w:val="clear"/>
             <w:tcMar>
               <w:top w:type="dxa" w:w="80"/>
@@ -1838,7 +1773,6 @@
         <w:tc>
           <w:tcPr>
             <w:tcW w:type="pct" w:w="40%"/>
-            <w:gridSpan w:val="1"/>
             <w:shd w:fill="FFFFFF" w:val="clear"/>
             <w:tcMar>
               <w:top w:type="dxa" w:w="80"/>
@@ -1865,7 +1799,6 @@
         <w:tc>
           <w:tcPr>
             <w:tcW w:type="pct" w:w="25%"/>
-            <w:gridSpan w:val="1"/>
             <w:shd w:fill="FFFFFF" w:val="clear"/>
             <w:tcMar>
               <w:top w:type="dxa" w:w="80"/>
@@ -1890,7 +1823,6 @@
         <w:tc>
           <w:tcPr>
             <w:tcW w:type="pct" w:w="35%"/>
-            <w:gridSpan w:val="1"/>
             <w:shd w:fill="FFFFFF" w:val="clear"/>
             <w:tcMar>
               <w:top w:type="dxa" w:w="80"/>
@@ -1915,7 +1847,6 @@
         <w:tc>
           <w:tcPr>
             <w:tcW w:type="pct" w:w="40%"/>
-            <w:gridSpan w:val="1"/>
             <w:shd w:fill="FFFFFF" w:val="clear"/>
             <w:tcMar>
               <w:top w:type="dxa" w:w="80"/>
@@ -1942,7 +1873,6 @@
         <w:tc>
           <w:tcPr>
             <w:tcW w:type="pct" w:w="25%"/>
-            <w:gridSpan w:val="1"/>
             <w:shd w:fill="FFFFFF" w:val="clear"/>
             <w:tcMar>
               <w:top w:type="dxa" w:w="80"/>
@@ -1967,7 +1897,6 @@
         <w:tc>
           <w:tcPr>
             <w:tcW w:type="pct" w:w="35%"/>
-            <w:gridSpan w:val="1"/>
             <w:shd w:fill="FFFFFF" w:val="clear"/>
             <w:tcMar>
               <w:top w:type="dxa" w:w="80"/>
@@ -1992,7 +1921,6 @@
         <w:tc>
           <w:tcPr>
             <w:tcW w:type="pct" w:w="40%"/>
-            <w:gridSpan w:val="1"/>
             <w:shd w:fill="FFFFFF" w:val="clear"/>
             <w:tcMar>
               <w:top w:type="dxa" w:w="80"/>
@@ -2019,7 +1947,6 @@
         <w:tc>
           <w:tcPr>
             <w:tcW w:type="pct" w:w="25%"/>
-            <w:gridSpan w:val="1"/>
             <w:shd w:fill="FFFFFF" w:val="clear"/>
             <w:tcMar>
               <w:top w:type="dxa" w:w="80"/>
@@ -2044,7 +1971,6 @@
         <w:tc>
           <w:tcPr>
             <w:tcW w:type="pct" w:w="35%"/>
-            <w:gridSpan w:val="1"/>
             <w:shd w:fill="FFFFFF" w:val="clear"/>
             <w:tcMar>
               <w:top w:type="dxa" w:w="80"/>
@@ -2069,7 +1995,6 @@
         <w:tc>
           <w:tcPr>
             <w:tcW w:type="pct" w:w="40%"/>
-            <w:gridSpan w:val="1"/>
             <w:shd w:fill="FFFFFF" w:val="clear"/>
             <w:tcMar>
               <w:top w:type="dxa" w:w="80"/>
@@ -2123,11 +2048,6 @@
       <w:pPr>
         <w:pStyle w:val="Heading1"/>
         <w:spacing w:after="120" w:before="400"/>
-        <w:rPr>
-          <w:b/>
-          <w:bCs/>
-          <w:color w:val="0D1B2A"/>
-        </w:rPr>
       </w:pPr>
       <w:r>
         <w:t xml:space="preserve">Deployment Model</w:t>
@@ -2278,11 +2198,6 @@
       <w:pPr>
         <w:pStyle w:val="Heading1"/>
         <w:spacing w:after="120" w:before="400"/>
-        <w:rPr>
-          <w:b/>
-          <w:bCs/>
-          <w:color w:val="0D1B2A"/>
-        </w:rPr>
       </w:pPr>
       <w:r>
         <w:t xml:space="preserve">Pricing &amp; Commercials</w:t>
@@ -2310,9 +2225,6 @@
       <w:pPr>
         <w:pStyle w:val="Heading2"/>
         <w:spacing w:after="80" w:before="320"/>
-        <w:rPr>
-          <w:color w:val="0D1B2A"/>
-        </w:rPr>
       </w:pPr>
       <w:r>
         <w:t xml:space="preserve">Option 1 — Pay Per Job</w:t>
@@ -2320,458 +2232,15 @@
     </w:p>
     <w:p>
       <w:pPr>
-        <w:spacing w:after="20" w:before="120"/>
-      </w:pPr>
-      <w:r>
-        <w:rPr>
-          <w:b/>
-          <w:bCs/>
-          <w:color w:val="0D1B2A"/>
-          <w:sz w:val="60"/>
-          <w:szCs w:val="60"/>
-        </w:rPr>
-        <w:t xml:space="preserve">R [TBD]</w:t>
-      </w:r>
-    </w:p>
-    <w:p>
-      <w:pPr>
-        <w:spacing w:after="160" w:before="0"/>
-      </w:pPr>
-      <w:r>
-        <w:rPr>
-          <w:i/>
-          <w:iCs/>
+        <w:spacing w:after="80" w:before="60"/>
+      </w:pPr>
+      <w:r>
+        <w:rPr>
           <w:color w:val="4B5563"/>
-          <w:sz w:val="18"/>
-          <w:szCs w:val="18"/>
-        </w:rPr>
-        <w:t xml:space="preserve">per analysis job submitted</w:t>
-      </w:r>
-    </w:p>
-    <w:p>
-      <w:pPr>
-        <w:spacing w:after="80" w:before="60"/>
-      </w:pPr>
-      <w:r>
-        <w:rPr>
-          <w:color w:val="4B5563"/>
-          <w:sz w:val="22"/>
-          <w:szCs w:val="22"/>
-        </w:rPr>
-        <w:t xml:space="preserve">Billed per video uploaded and processed. One job = one video file analysed, regardless of footage length. Invoiced monthly in arrears.</w:t>
-      </w:r>
-    </w:p>
-    <w:p>
-      <w:pPr>
-        <w:spacing w:after="0" w:before="0"/>
-      </w:pPr>
-    </w:p>
-    <w:p>
-      <w:pPr>
-        <w:spacing w:after="40" w:before="40"/>
-        <w:ind w:left="431"/>
-      </w:pPr>
-      <w:r>
-        <w:rPr>
-          <w:b/>
-          <w:bCs/>
-          <w:color w:val="00C9A7"/>
-          <w:sz w:val="22"/>
-          <w:szCs w:val="22"/>
-        </w:rPr>
-        <w:t xml:space="preserve">✓  </w:t>
-      </w:r>
-      <w:r>
-        <w:rPr>
-          <w:color w:val="4B5563"/>
-          <w:sz w:val="22"/>
-          <w:szCs w:val="22"/>
-        </w:rPr>
-        <w:t xml:space="preserve">No upfront commitment required</w:t>
-      </w:r>
-    </w:p>
-    <w:p>
-      <w:pPr>
-        <w:spacing w:after="40" w:before="40"/>
-        <w:ind w:left="431"/>
-      </w:pPr>
-      <w:r>
-        <w:rPr>
-          <w:b/>
-          <w:bCs/>
-          <w:color w:val="00C9A7"/>
-          <w:sz w:val="22"/>
-          <w:szCs w:val="22"/>
-        </w:rPr>
-        <w:t xml:space="preserve">✓  </w:t>
-      </w:r>
-      <w:r>
-        <w:rPr>
-          <w:color w:val="4B5563"/>
-          <w:sz w:val="22"/>
-          <w:szCs w:val="22"/>
-        </w:rPr>
-        <w:t xml:space="preserve">Full object detection &amp; tracking per job</w:t>
-      </w:r>
-    </w:p>
-    <w:p>
-      <w:pPr>
-        <w:spacing w:after="40" w:before="40"/>
-        <w:ind w:left="431"/>
-      </w:pPr>
-      <w:r>
-        <w:rPr>
-          <w:b/>
-          <w:bCs/>
-          <w:color w:val="00C9A7"/>
-          <w:sz w:val="22"/>
-          <w:szCs w:val="22"/>
-        </w:rPr>
-        <w:t xml:space="preserve">✓  </w:t>
-      </w:r>
-      <w:r>
-        <w:rPr>
-          <w:color w:val="4B5563"/>
-          <w:sz w:val="22"/>
-          <w:szCs w:val="22"/>
-        </w:rPr>
-        <w:t xml:space="preserve">6-sheet Excel analytics report per job</w:t>
-      </w:r>
-    </w:p>
-    <w:p>
-      <w:pPr>
-        <w:spacing w:after="40" w:before="40"/>
-        <w:ind w:left="431"/>
-      </w:pPr>
-      <w:r>
-        <w:rPr>
-          <w:b/>
-          <w:bCs/>
-          <w:color w:val="00C9A7"/>
-          <w:sz w:val="22"/>
-          <w:szCs w:val="22"/>
-        </w:rPr>
-        <w:t xml:space="preserve">✓  </w:t>
-      </w:r>
-      <w:r>
-        <w:rPr>
-          <w:color w:val="4B5563"/>
-          <w:sz w:val="22"/>
-          <w:szCs w:val="22"/>
-        </w:rPr>
-        <w:t xml:space="preserve">Annotated video output per job</w:t>
-      </w:r>
-    </w:p>
-    <w:p>
-      <w:pPr>
-        <w:spacing w:after="40" w:before="40"/>
-        <w:ind w:left="431"/>
-      </w:pPr>
-      <w:r>
-        <w:rPr>
-          <w:b/>
-          <w:bCs/>
-          <w:color w:val="00C9A7"/>
-          <w:sz w:val="22"/>
-          <w:szCs w:val="22"/>
-        </w:rPr>
-        <w:t xml:space="preserve">✓  </w:t>
-      </w:r>
-      <w:r>
-        <w:rPr>
-          <w:color w:val="4B5563"/>
-          <w:sz w:val="22"/>
-          <w:szCs w:val="22"/>
-        </w:rPr>
-        <w:t xml:space="preserve">Ideal for irregular or ad-hoc usage</w:t>
-      </w:r>
-    </w:p>
-    <w:p>
-      <w:pPr>
-        <w:spacing w:after="40" w:before="40"/>
-        <w:ind w:left="431"/>
-      </w:pPr>
-      <w:r>
-        <w:rPr>
-          <w:b/>
-          <w:bCs/>
-          <w:color w:val="00C9A7"/>
-          <w:sz w:val="22"/>
-          <w:szCs w:val="22"/>
-        </w:rPr>
-        <w:t xml:space="preserve">✓  </w:t>
-      </w:r>
-      <w:r>
-        <w:rPr>
-          <w:color w:val="4B5563"/>
-          <w:sz w:val="22"/>
-          <w:szCs w:val="22"/>
-        </w:rPr>
-        <w:t xml:space="preserve">Monthly invoice with itemised job log</w:t>
-      </w:r>
-    </w:p>
-    <w:p>
-      <w:pPr>
-        <w:spacing w:after="0" w:before="0"/>
-      </w:pPr>
-    </w:p>
-    <w:p>
-      <w:pPr>
-        <w:pStyle w:val="Heading2"/>
-        <w:spacing w:after="80" w:before="320"/>
-        <w:rPr>
-          <w:color w:val="0D1B2A"/>
-        </w:rPr>
-      </w:pPr>
-      <w:r>
-        <w:t xml:space="preserve">Option 2 — Prepaid Hour Credits</w:t>
-      </w:r>
-    </w:p>
-    <w:p>
-      <w:pPr>
-        <w:spacing w:after="20" w:before="120"/>
-      </w:pPr>
-      <w:r>
-        <w:rPr>
-          <w:b/>
-          <w:bCs/>
-          <w:color w:val="0D1B2A"/>
-          <w:sz w:val="60"/>
-          <w:szCs w:val="60"/>
-        </w:rPr>
-        <w:t xml:space="preserve">R 225</w:t>
-      </w:r>
-    </w:p>
-    <w:p>
-      <w:pPr>
-        <w:spacing w:after="160" w:before="0"/>
-      </w:pPr>
-      <w:r>
-        <w:rPr>
-          <w:i/>
-          <w:iCs/>
-          <w:color w:val="4B5563"/>
-          <w:sz w:val="18"/>
-          <w:szCs w:val="18"/>
-        </w:rPr>
-        <w:t xml:space="preserve">per credit · 1 credit = 1 hour of footage processed</w:t>
-      </w:r>
-    </w:p>
-    <w:p>
-      <w:pPr>
-        <w:pBdr>
-          <w:top w:val="single" w:color="1A56DB" w:sz="4"/>
-          <w:bottom w:val="single" w:color="1A56DB" w:sz="4"/>
-          <w:left w:val="single" w:color="1A56DB" w:sz="12"/>
-          <w:right w:val="single" w:color="1A56DB" w:sz="4"/>
-        </w:pBdr>
-        <w:shd w:fill="E8F0FE" w:val="clear"/>
-        <w:spacing w:after="200" w:before="100"/>
-        <w:ind w:left="288" w:right="288"/>
-      </w:pPr>
-      <w:r>
-        <w:rPr>
-          <w:b w:val="false"/>
-          <w:bCs w:val="false"/>
-          <w:color w:val="0D1B2A"/>
-          <w:sz w:val="21"/>
-          <w:szCs w:val="21"/>
-        </w:rPr>
-        <w:t xml:space="preserve">Credits are purchased in 100-hour blocks (minimum purchase).</w:t>
-      </w:r>
-      <w:r>
-        <w:br/>
-      </w:r>
-      <w:r>
-        <w:rPr>
-          <w:b/>
-          <w:bCs/>
-          <w:color w:val="0D1B2A"/>
-          <w:sz w:val="21"/>
-          <w:szCs w:val="21"/>
-        </w:rPr>
-        <w:t xml:space="preserve">Block price: R 22,500 per 100-hour pack (excl. VAT).</w:t>
-      </w:r>
-      <w:r>
-        <w:br/>
-      </w:r>
-      <w:r>
-        <w:rPr>
-          <w:b w:val="false"/>
-          <w:bCs w:val="false"/>
-          <w:color w:val="0D1B2A"/>
-          <w:sz w:val="21"/>
-          <w:szCs w:val="21"/>
-        </w:rPr>
-        <w:t xml:space="preserve">Credits never expire and roll over month to month.</w:t>
-      </w:r>
-    </w:p>
-    <w:p>
-      <w:pPr>
-        <w:spacing w:after="40" w:before="40"/>
-        <w:ind w:left="431"/>
-      </w:pPr>
-      <w:r>
-        <w:rPr>
-          <w:b/>
-          <w:bCs/>
-          <w:color w:val="00C9A7"/>
-          <w:sz w:val="22"/>
-          <w:szCs w:val="22"/>
-        </w:rPr>
-        <w:t xml:space="preserve">✓  </w:t>
-      </w:r>
-      <w:r>
-        <w:rPr>
-          <w:color w:val="4B5563"/>
-          <w:sz w:val="22"/>
-          <w:szCs w:val="22"/>
-        </w:rPr>
-        <w:t xml:space="preserve">100-hour minimum purchase per order</w:t>
-      </w:r>
-    </w:p>
-    <w:p>
-      <w:pPr>
-        <w:spacing w:after="40" w:before="40"/>
-        <w:ind w:left="431"/>
-      </w:pPr>
-      <w:r>
-        <w:rPr>
-          <w:b/>
-          <w:bCs/>
-          <w:color w:val="00C9A7"/>
-          <w:sz w:val="22"/>
-          <w:szCs w:val="22"/>
-        </w:rPr>
-        <w:t xml:space="preserve">✓  </w:t>
-      </w:r>
-      <w:r>
-        <w:rPr>
-          <w:color w:val="4B5563"/>
-          <w:sz w:val="22"/>
-          <w:szCs w:val="22"/>
-        </w:rPr>
-        <w:t xml:space="preserve">Credits deducted by footage duration processed</w:t>
-      </w:r>
-    </w:p>
-    <w:p>
-      <w:pPr>
-        <w:spacing w:after="40" w:before="40"/>
-        <w:ind w:left="431"/>
-      </w:pPr>
-      <w:r>
-        <w:rPr>
-          <w:b/>
-          <w:bCs/>
-          <w:color w:val="00C9A7"/>
-          <w:sz w:val="22"/>
-          <w:szCs w:val="22"/>
-        </w:rPr>
-        <w:t xml:space="preserve">✓  </w:t>
-      </w:r>
-      <w:r>
-        <w:rPr>
-          <w:color w:val="4B5563"/>
-          <w:sz w:val="22"/>
-          <w:szCs w:val="22"/>
-        </w:rPr>
-        <w:t xml:space="preserve">Lower effective rate vs. pay-per-job</w:t>
-      </w:r>
-    </w:p>
-    <w:p>
-      <w:pPr>
-        <w:spacing w:after="40" w:before="40"/>
-        <w:ind w:left="431"/>
-      </w:pPr>
-      <w:r>
-        <w:rPr>
-          <w:b/>
-          <w:bCs/>
-          <w:color w:val="00C9A7"/>
-          <w:sz w:val="22"/>
-          <w:szCs w:val="22"/>
-        </w:rPr>
-        <w:t xml:space="preserve">✓  </w:t>
-      </w:r>
-      <w:r>
-        <w:rPr>
-          <w:color w:val="4B5563"/>
-          <w:sz w:val="22"/>
-          <w:szCs w:val="22"/>
-        </w:rPr>
-        <w:t xml:space="preserve">Full analytics report &amp; annotated video per job</w:t>
-      </w:r>
-    </w:p>
-    <w:p>
-      <w:pPr>
-        <w:spacing w:after="40" w:before="40"/>
-        <w:ind w:left="431"/>
-      </w:pPr>
-      <w:r>
-        <w:rPr>
-          <w:b/>
-          <w:bCs/>
-          <w:color w:val="00C9A7"/>
-          <w:sz w:val="22"/>
-          <w:szCs w:val="22"/>
-        </w:rPr>
-        <w:t xml:space="preserve">✓  </w:t>
-      </w:r>
-      <w:r>
-        <w:rPr>
-          <w:color w:val="4B5563"/>
-          <w:sz w:val="22"/>
-          <w:szCs w:val="22"/>
-        </w:rPr>
-        <w:t xml:space="preserve">Real-time credit balance visible on dashboard</w:t>
-      </w:r>
-    </w:p>
-    <w:p>
-      <w:pPr>
-        <w:spacing w:after="40" w:before="40"/>
-        <w:ind w:left="431"/>
-      </w:pPr>
-      <w:r>
-        <w:rPr>
-          <w:b/>
-          <w:bCs/>
-          <w:color w:val="00C9A7"/>
-          <w:sz w:val="22"/>
-          <w:szCs w:val="22"/>
-        </w:rPr>
-        <w:t xml:space="preserve">✓  </w:t>
-      </w:r>
-      <w:r>
-        <w:rPr>
-          <w:color w:val="4B5563"/>
-          <w:sz w:val="22"/>
-          <w:szCs w:val="22"/>
-        </w:rPr>
-        <w:t xml:space="preserve">Top-up at any time in 100-hour increments</w:t>
-      </w:r>
-    </w:p>
-    <w:p>
-      <w:pPr>
-        <w:spacing w:after="40" w:before="40"/>
-        <w:ind w:left="431"/>
-      </w:pPr>
-      <w:r>
-        <w:rPr>
-          <w:b/>
-          <w:bCs/>
-          <w:color w:val="00C9A7"/>
-          <w:sz w:val="22"/>
-          <w:szCs w:val="22"/>
-        </w:rPr>
-        <w:t xml:space="preserve">✓  </w:t>
-      </w:r>
-      <w:r>
-        <w:rPr>
-          <w:color w:val="4B5563"/>
-          <w:sz w:val="22"/>
-          <w:szCs w:val="22"/>
-        </w:rPr>
-        <w:t xml:space="preserve">Unused credits roll over — no expiry</w:t>
+          <w:sz w:val="22"/>
+          <w:szCs w:val="22"/>
+        </w:rPr>
+        <w:t xml:space="preserve">Three tiers based on footage length. Billed per video uploaded and processed. Invoiced monthly in arrears.</w:t>
       </w:r>
     </w:p>
     <w:p>
@@ -2800,8 +2269,7 @@
       <w:tr>
         <w:tc>
           <w:tcPr>
-            <w:tcW w:type="pct" w:w="33%"/>
-            <w:gridSpan w:val="1"/>
+            <w:tcW w:type="pct" w:w="30%"/>
             <w:shd w:fill="0D1B2A" w:val="clear"/>
             <w:tcMar>
               <w:top w:type="dxa" w:w="80"/>
@@ -2819,14 +2287,13 @@
                 <w:sz w:val="20"/>
                 <w:szCs w:val="20"/>
               </w:rPr>
-              <w:t xml:space="preserve">Minimum Block</w:t>
-            </w:r>
-          </w:p>
-        </w:tc>
-        <w:tc>
-          <w:tcPr>
-            <w:tcW w:type="pct" w:w="33%"/>
-            <w:gridSpan w:val="1"/>
+              <w:t xml:space="preserve">Tier</w:t>
+            </w:r>
+          </w:p>
+        </w:tc>
+        <w:tc>
+          <w:tcPr>
+            <w:tcW w:type="pct" w:w="40%"/>
             <w:shd w:fill="0D1B2A" w:val="clear"/>
             <w:tcMar>
               <w:top w:type="dxa" w:w="80"/>
@@ -2844,14 +2311,13 @@
                 <w:sz w:val="20"/>
                 <w:szCs w:val="20"/>
               </w:rPr>
-              <w:t xml:space="preserve">Rate per Hour</w:t>
-            </w:r>
-          </w:p>
-        </w:tc>
-        <w:tc>
-          <w:tcPr>
-            <w:tcW w:type="pct" w:w="34%"/>
-            <w:gridSpan w:val="1"/>
+              <w:t xml:space="preserve">Duration</w:t>
+            </w:r>
+          </w:p>
+        </w:tc>
+        <w:tc>
+          <w:tcPr>
+            <w:tcW w:type="pct" w:w="30%"/>
             <w:shd w:fill="0D1B2A" w:val="clear"/>
             <w:tcMar>
               <w:top w:type="dxa" w:w="80"/>
@@ -2869,7 +2335,7 @@
                 <w:sz w:val="20"/>
                 <w:szCs w:val="20"/>
               </w:rPr>
-              <w:t xml:space="preserve">Block Total (excl. VAT)</w:t>
+              <w:t xml:space="preserve">Price (ZAR)</w:t>
             </w:r>
           </w:p>
         </w:tc>
@@ -2877,82 +2343,221 @@
       <w:tr>
         <w:tc>
           <w:tcPr>
-            <w:tcW w:type="pct" w:w="33%"/>
+            <w:tcW w:type="pct" w:w="30%"/>
             <w:shd w:fill="F8F9FB" w:val="clear"/>
             <w:tcMar>
-              <w:top w:type="dxa" w:w="140"/>
-              <w:left w:type="dxa" w:w="160"/>
-              <w:bottom w:type="dxa" w:w="140"/>
-              <w:right w:type="dxa" w:w="160"/>
-            </w:tcMar>
-          </w:tcPr>
-          <w:p>
-            <w:pPr>
-              <w:jc w:val="center"/>
-            </w:pPr>
+              <w:top w:type="dxa" w:w="80"/>
+              <w:left w:type="dxa" w:w="120"/>
+              <w:bottom w:type="dxa" w:w="80"/>
+              <w:right w:type="dxa" w:w="120"/>
+            </w:tcMar>
+          </w:tcPr>
+          <w:p>
+            <w:r>
+              <w:rPr>
+                <w:b/>
+                <w:bCs/>
+                <w:color w:val="111827"/>
+                <w:sz w:val="20"/>
+                <w:szCs w:val="20"/>
+              </w:rPr>
+              <w:t xml:space="preserve">Short</w:t>
+            </w:r>
+          </w:p>
+        </w:tc>
+        <w:tc>
+          <w:tcPr>
+            <w:tcW w:type="pct" w:w="40%"/>
+            <w:shd w:fill="FFFFFF" w:val="clear"/>
+            <w:tcMar>
+              <w:top w:type="dxa" w:w="80"/>
+              <w:left w:type="dxa" w:w="120"/>
+              <w:bottom w:type="dxa" w:w="80"/>
+              <w:right w:type="dxa" w:w="120"/>
+            </w:tcMar>
+          </w:tcPr>
+          <w:p>
+            <w:r>
+              <w:rPr>
+                <w:b w:val="false"/>
+                <w:bCs w:val="false"/>
+                <w:color w:val="111827"/>
+                <w:sz w:val="20"/>
+                <w:szCs w:val="20"/>
+              </w:rPr>
+              <w:t xml:space="preserve">Up to 30 minutes</w:t>
+            </w:r>
+          </w:p>
+        </w:tc>
+        <w:tc>
+          <w:tcPr>
+            <w:tcW w:type="pct" w:w="30%"/>
+            <w:shd w:fill="FFFFFF" w:val="clear"/>
+            <w:tcMar>
+              <w:top w:type="dxa" w:w="80"/>
+              <w:left w:type="dxa" w:w="120"/>
+              <w:bottom w:type="dxa" w:w="80"/>
+              <w:right w:type="dxa" w:w="120"/>
+            </w:tcMar>
+          </w:tcPr>
+          <w:p>
             <w:r>
               <w:rPr>
                 <w:b/>
                 <w:bCs/>
                 <w:color w:val="0D1B2A"/>
-                <w:sz w:val="28"/>
-                <w:szCs w:val="28"/>
-              </w:rPr>
-              <w:t xml:space="preserve">100 hours</w:t>
-            </w:r>
-          </w:p>
-        </w:tc>
-        <w:tc>
-          <w:tcPr>
-            <w:tcW w:type="pct" w:w="33%"/>
+                <w:sz w:val="20"/>
+                <w:szCs w:val="20"/>
+              </w:rPr>
+              <w:t xml:space="preserve">R 375</w:t>
+            </w:r>
+          </w:p>
+        </w:tc>
+      </w:tr>
+      <w:tr>
+        <w:tc>
+          <w:tcPr>
+            <w:tcW w:type="pct" w:w="30%"/>
+            <w:shd w:fill="FFFFFF" w:val="clear"/>
+            <w:tcMar>
+              <w:top w:type="dxa" w:w="80"/>
+              <w:left w:type="dxa" w:w="120"/>
+              <w:bottom w:type="dxa" w:w="80"/>
+              <w:right w:type="dxa" w:w="120"/>
+            </w:tcMar>
+          </w:tcPr>
+          <w:p>
+            <w:r>
+              <w:rPr>
+                <w:b/>
+                <w:bCs/>
+                <w:color w:val="111827"/>
+                <w:sz w:val="20"/>
+                <w:szCs w:val="20"/>
+              </w:rPr>
+              <w:t xml:space="preserve">Standard</w:t>
+            </w:r>
+          </w:p>
+        </w:tc>
+        <w:tc>
+          <w:tcPr>
+            <w:tcW w:type="pct" w:w="40%"/>
+            <w:shd w:fill="FFFFFF" w:val="clear"/>
+            <w:tcMar>
+              <w:top w:type="dxa" w:w="80"/>
+              <w:left w:type="dxa" w:w="120"/>
+              <w:bottom w:type="dxa" w:w="80"/>
+              <w:right w:type="dxa" w:w="120"/>
+            </w:tcMar>
+          </w:tcPr>
+          <w:p>
+            <w:r>
+              <w:rPr>
+                <w:b w:val="false"/>
+                <w:bCs w:val="false"/>
+                <w:color w:val="111827"/>
+                <w:sz w:val="20"/>
+                <w:szCs w:val="20"/>
+              </w:rPr>
+              <w:t xml:space="preserve">30 min – 1 hour</w:t>
+            </w:r>
+          </w:p>
+        </w:tc>
+        <w:tc>
+          <w:tcPr>
+            <w:tcW w:type="pct" w:w="30%"/>
+            <w:shd w:fill="FFFFFF" w:val="clear"/>
+            <w:tcMar>
+              <w:top w:type="dxa" w:w="80"/>
+              <w:left w:type="dxa" w:w="120"/>
+              <w:bottom w:type="dxa" w:w="80"/>
+              <w:right w:type="dxa" w:w="120"/>
+            </w:tcMar>
+          </w:tcPr>
+          <w:p>
+            <w:r>
+              <w:rPr>
+                <w:b/>
+                <w:bCs/>
+                <w:color w:val="0D1B2A"/>
+                <w:sz w:val="20"/>
+                <w:szCs w:val="20"/>
+              </w:rPr>
+              <w:t xml:space="preserve">R 875</w:t>
+            </w:r>
+          </w:p>
+        </w:tc>
+      </w:tr>
+      <w:tr>
+        <w:tc>
+          <w:tcPr>
+            <w:tcW w:type="pct" w:w="30%"/>
             <w:shd w:fill="F8F9FB" w:val="clear"/>
             <w:tcMar>
-              <w:top w:type="dxa" w:w="140"/>
-              <w:left w:type="dxa" w:w="160"/>
-              <w:bottom w:type="dxa" w:w="140"/>
-              <w:right w:type="dxa" w:w="160"/>
-            </w:tcMar>
-          </w:tcPr>
-          <w:p>
-            <w:pPr>
-              <w:jc w:val="center"/>
-            </w:pPr>
-            <w:r>
-              <w:rPr>
-                <w:b/>
-                <w:bCs/>
-                <w:color w:val="00C9A7"/>
-                <w:sz w:val="28"/>
-                <w:szCs w:val="28"/>
-              </w:rPr>
-              <w:t xml:space="preserve">R 225</w:t>
-            </w:r>
-          </w:p>
-        </w:tc>
-        <w:tc>
-          <w:tcPr>
-            <w:tcW w:type="pct" w:w="34%"/>
-            <w:shd w:fill="F8F9FB" w:val="clear"/>
-            <w:tcMar>
-              <w:top w:type="dxa" w:w="140"/>
-              <w:left w:type="dxa" w:w="160"/>
-              <w:bottom w:type="dxa" w:w="140"/>
-              <w:right w:type="dxa" w:w="160"/>
-            </w:tcMar>
-          </w:tcPr>
-          <w:p>
-            <w:pPr>
-              <w:jc w:val="center"/>
-            </w:pPr>
+              <w:top w:type="dxa" w:w="80"/>
+              <w:left w:type="dxa" w:w="120"/>
+              <w:bottom w:type="dxa" w:w="80"/>
+              <w:right w:type="dxa" w:w="120"/>
+            </w:tcMar>
+          </w:tcPr>
+          <w:p>
+            <w:r>
+              <w:rPr>
+                <w:b/>
+                <w:bCs/>
+                <w:color w:val="111827"/>
+                <w:sz w:val="20"/>
+                <w:szCs w:val="20"/>
+              </w:rPr>
+              <w:t xml:space="preserve">Long</w:t>
+            </w:r>
+          </w:p>
+        </w:tc>
+        <w:tc>
+          <w:tcPr>
+            <w:tcW w:type="pct" w:w="40%"/>
+            <w:shd w:fill="FFFFFF" w:val="clear"/>
+            <w:tcMar>
+              <w:top w:type="dxa" w:w="80"/>
+              <w:left w:type="dxa" w:w="120"/>
+              <w:bottom w:type="dxa" w:w="80"/>
+              <w:right w:type="dxa" w:w="120"/>
+            </w:tcMar>
+          </w:tcPr>
+          <w:p>
+            <w:r>
+              <w:rPr>
+                <w:b w:val="false"/>
+                <w:bCs w:val="false"/>
+                <w:color w:val="111827"/>
+                <w:sz w:val="20"/>
+                <w:szCs w:val="20"/>
+              </w:rPr>
+              <w:t xml:space="preserve">1 – 2 hours</w:t>
+            </w:r>
+          </w:p>
+        </w:tc>
+        <w:tc>
+          <w:tcPr>
+            <w:tcW w:type="pct" w:w="30%"/>
+            <w:shd w:fill="FFFFFF" w:val="clear"/>
+            <w:tcMar>
+              <w:top w:type="dxa" w:w="80"/>
+              <w:left w:type="dxa" w:w="120"/>
+              <w:bottom w:type="dxa" w:w="80"/>
+              <w:right w:type="dxa" w:w="120"/>
+            </w:tcMar>
+          </w:tcPr>
+          <w:p>
             <w:r>
               <w:rPr>
                 <w:b/>
                 <w:bCs/>
                 <w:color w:val="0D1B2A"/>
-                <w:sz w:val="28"/>
-                <w:szCs w:val="28"/>
-              </w:rPr>
-              <w:t xml:space="preserve">R 22,500</w:t>
+                <w:sz w:val="20"/>
+                <w:szCs w:val="20"/>
+              </w:rPr>
+              <w:t xml:space="preserve">R 1,099</w:t>
             </w:r>
           </w:p>
         </w:tc>
@@ -2975,42 +2580,422 @@
           <w:sz w:val="18"/>
           <w:szCs w:val="18"/>
         </w:rPr>
-        <w:t xml:space="preserve">All prices are in South African Rand (ZAR) and exclude VAT at the prevailing rate. Hardware procurement (Lenovo P360, Axelera M.2 card) is quoted separately. Platform deployment fee applies — contact us for a tailored quote.</w:t>
-      </w:r>
-    </w:p>
-    <w:p>
-      <w:r>
-        <w:br w:type="page"/>
-      </w:r>
-    </w:p>
-    <w:p>
-      <w:pPr>
-        <w:spacing w:after="60" w:before="200"/>
+        <w:t xml:space="preserve">Footage over 2 hours — prepaid credits are recommended for better value.</w:t>
+      </w:r>
+    </w:p>
+    <w:p>
+      <w:pPr>
+        <w:spacing w:after="0" w:before="0"/>
+      </w:pPr>
+    </w:p>
+    <w:p>
+      <w:pPr>
+        <w:spacing w:after="40" w:before="40"/>
+        <w:ind w:left="431"/>
       </w:pPr>
       <w:r>
         <w:rPr>
           <w:b/>
           <w:bCs/>
-          <w:color w:val="1A56DB"/>
-          <w:spacing w:val="60"/>
-          <w:sz w:val="18"/>
-          <w:szCs w:val="18"/>
-        </w:rPr>
-        <w:t xml:space="preserve">OPTIONAL</w:t>
-      </w:r>
-    </w:p>
-    <w:p>
-      <w:pPr>
-        <w:pStyle w:val="Heading1"/>
-        <w:spacing w:after="120" w:before="400"/>
+          <w:color w:val="00C9A7"/>
+          <w:sz w:val="22"/>
+          <w:szCs w:val="22"/>
+        </w:rPr>
+        <w:t xml:space="preserve">✓  </w:t>
+      </w:r>
+      <w:r>
+        <w:rPr>
+          <w:color w:val="4B5563"/>
+          <w:sz w:val="22"/>
+          <w:szCs w:val="22"/>
+        </w:rPr>
+        <w:t xml:space="preserve">No upfront commitment required</w:t>
+      </w:r>
+    </w:p>
+    <w:p>
+      <w:pPr>
+        <w:spacing w:after="40" w:before="40"/>
+        <w:ind w:left="431"/>
+      </w:pPr>
+      <w:r>
+        <w:rPr>
+          <w:b/>
+          <w:bCs/>
+          <w:color w:val="00C9A7"/>
+          <w:sz w:val="22"/>
+          <w:szCs w:val="22"/>
+        </w:rPr>
+        <w:t xml:space="preserve">✓  </w:t>
+      </w:r>
+      <w:r>
+        <w:rPr>
+          <w:color w:val="4B5563"/>
+          <w:sz w:val="22"/>
+          <w:szCs w:val="22"/>
+        </w:rPr>
+        <w:t xml:space="preserve">Full object detection &amp; tracking per job</w:t>
+      </w:r>
+    </w:p>
+    <w:p>
+      <w:pPr>
+        <w:spacing w:after="40" w:before="40"/>
+        <w:ind w:left="431"/>
+      </w:pPr>
+      <w:r>
+        <w:rPr>
+          <w:b/>
+          <w:bCs/>
+          <w:color w:val="00C9A7"/>
+          <w:sz w:val="22"/>
+          <w:szCs w:val="22"/>
+        </w:rPr>
+        <w:t xml:space="preserve">✓  </w:t>
+      </w:r>
+      <w:r>
+        <w:rPr>
+          <w:color w:val="4B5563"/>
+          <w:sz w:val="22"/>
+          <w:szCs w:val="22"/>
+        </w:rPr>
+        <w:t xml:space="preserve">6-sheet Excel analytics report per job</w:t>
+      </w:r>
+    </w:p>
+    <w:p>
+      <w:pPr>
+        <w:spacing w:after="40" w:before="40"/>
+        <w:ind w:left="431"/>
+      </w:pPr>
+      <w:r>
+        <w:rPr>
+          <w:b/>
+          <w:bCs/>
+          <w:color w:val="00C9A7"/>
+          <w:sz w:val="22"/>
+          <w:szCs w:val="22"/>
+        </w:rPr>
+        <w:t xml:space="preserve">✓  </w:t>
+      </w:r>
+      <w:r>
+        <w:rPr>
+          <w:color w:val="4B5563"/>
+          <w:sz w:val="22"/>
+          <w:szCs w:val="22"/>
+        </w:rPr>
+        <w:t xml:space="preserve">Annotated video output per job</w:t>
+      </w:r>
+    </w:p>
+    <w:p>
+      <w:pPr>
+        <w:spacing w:after="40" w:before="40"/>
+        <w:ind w:left="431"/>
+      </w:pPr>
+      <w:r>
+        <w:rPr>
+          <w:b/>
+          <w:bCs/>
+          <w:color w:val="00C9A7"/>
+          <w:sz w:val="22"/>
+          <w:szCs w:val="22"/>
+        </w:rPr>
+        <w:t xml:space="preserve">✓  </w:t>
+      </w:r>
+      <w:r>
+        <w:rPr>
+          <w:color w:val="4B5563"/>
+          <w:sz w:val="22"/>
+          <w:szCs w:val="22"/>
+        </w:rPr>
+        <w:t xml:space="preserve">Ideal for irregular or ad-hoc usage</w:t>
+      </w:r>
+    </w:p>
+    <w:p>
+      <w:pPr>
+        <w:spacing w:after="40" w:before="40"/>
+        <w:ind w:left="431"/>
+      </w:pPr>
+      <w:r>
+        <w:rPr>
+          <w:b/>
+          <w:bCs/>
+          <w:color w:val="00C9A7"/>
+          <w:sz w:val="22"/>
+          <w:szCs w:val="22"/>
+        </w:rPr>
+        <w:t xml:space="preserve">✓  </w:t>
+      </w:r>
+      <w:r>
+        <w:rPr>
+          <w:color w:val="4B5563"/>
+          <w:sz w:val="22"/>
+          <w:szCs w:val="22"/>
+        </w:rPr>
+        <w:t xml:space="preserve">Monthly invoice with itemised job log</w:t>
+      </w:r>
+    </w:p>
+    <w:p>
+      <w:pPr>
+        <w:spacing w:after="0" w:before="0"/>
+      </w:pPr>
+    </w:p>
+    <w:p>
+      <w:pPr>
+        <w:spacing w:after="0" w:before="0"/>
+      </w:pPr>
+    </w:p>
+    <w:p>
+      <w:pPr>
+        <w:pStyle w:val="Heading2"/>
+        <w:spacing w:after="80" w:before="320"/>
+      </w:pPr>
+      <w:r>
+        <w:t xml:space="preserve">Option 2 — Prepaid Hour Credits</w:t>
+      </w:r>
+    </w:p>
+    <w:p>
+      <w:pPr>
+        <w:spacing w:after="20" w:before="120"/>
+      </w:pPr>
+      <w:r>
         <w:rPr>
           <w:b/>
           <w:bCs/>
           <w:color w:val="0D1B2A"/>
-        </w:rPr>
-      </w:pPr>
-      <w:r>
-        <w:t xml:space="preserve">Add-On Services</w:t>
+          <w:sz w:val="60"/>
+          <w:szCs w:val="60"/>
+        </w:rPr>
+        <w:t xml:space="preserve">R 225</w:t>
+      </w:r>
+    </w:p>
+    <w:p>
+      <w:pPr>
+        <w:spacing w:after="160" w:before="0"/>
+      </w:pPr>
+      <w:r>
+        <w:rPr>
+          <w:i/>
+          <w:iCs/>
+          <w:color w:val="4B5563"/>
+          <w:sz w:val="18"/>
+          <w:szCs w:val="18"/>
+        </w:rPr>
+        <w:t xml:space="preserve">per credit · 1 credit = 1 hour of footage</w:t>
+      </w:r>
+    </w:p>
+    <w:p>
+      <w:pPr>
+        <w:pBdr>
+          <w:top w:val="single" w:color="1A56DB" w:sz="4"/>
+          <w:bottom w:val="single" w:color="1A56DB" w:sz="4"/>
+          <w:left w:val="single" w:color="1A56DB" w:sz="12"/>
+          <w:right w:val="single" w:color="1A56DB" w:sz="4"/>
+        </w:pBdr>
+        <w:shd w:fill="E8F0FE" w:val="clear"/>
+        <w:spacing w:after="200" w:before="100"/>
+        <w:ind w:left="288" w:right="288"/>
+      </w:pPr>
+      <w:r>
+        <w:rPr>
+          <w:b w:val="false"/>
+          <w:bCs w:val="false"/>
+          <w:color w:val="0D1B2A"/>
+          <w:sz w:val="21"/>
+          <w:szCs w:val="21"/>
+        </w:rPr>
+        <w:t xml:space="preserve">Credits are purchased in 100-hour blocks (minimum purchase).</w:t>
+      </w:r>
+      <w:r>
+        <w:br/>
+      </w:r>
+      <w:r>
+        <w:rPr>
+          <w:b/>
+          <w:bCs/>
+          <w:color w:val="0D1B2A"/>
+          <w:sz w:val="21"/>
+          <w:szCs w:val="21"/>
+        </w:rPr>
+        <w:t xml:space="preserve">Block price: R 22,500 per 100-hour pack (excl. VAT).</w:t>
+      </w:r>
+      <w:r>
+        <w:br/>
+      </w:r>
+      <w:r>
+        <w:rPr>
+          <w:b w:val="false"/>
+          <w:bCs w:val="false"/>
+          <w:color w:val="0D1B2A"/>
+          <w:sz w:val="21"/>
+          <w:szCs w:val="21"/>
+        </w:rPr>
+        <w:t xml:space="preserve">Credits never expire and roll over month to month.</w:t>
+      </w:r>
+    </w:p>
+    <w:p>
+      <w:pPr>
+        <w:spacing w:after="40" w:before="40"/>
+        <w:ind w:left="431"/>
+      </w:pPr>
+      <w:r>
+        <w:rPr>
+          <w:b/>
+          <w:bCs/>
+          <w:color w:val="00C9A7"/>
+          <w:sz w:val="22"/>
+          <w:szCs w:val="22"/>
+        </w:rPr>
+        <w:t xml:space="preserve">✓  </w:t>
+      </w:r>
+      <w:r>
+        <w:rPr>
+          <w:color w:val="4B5563"/>
+          <w:sz w:val="22"/>
+          <w:szCs w:val="22"/>
+        </w:rPr>
+        <w:t xml:space="preserve">100-hour minimum purchase per order</w:t>
+      </w:r>
+    </w:p>
+    <w:p>
+      <w:pPr>
+        <w:spacing w:after="40" w:before="40"/>
+        <w:ind w:left="431"/>
+      </w:pPr>
+      <w:r>
+        <w:rPr>
+          <w:b/>
+          <w:bCs/>
+          <w:color w:val="00C9A7"/>
+          <w:sz w:val="22"/>
+          <w:szCs w:val="22"/>
+        </w:rPr>
+        <w:t xml:space="preserve">✓  </w:t>
+      </w:r>
+      <w:r>
+        <w:rPr>
+          <w:color w:val="4B5563"/>
+          <w:sz w:val="22"/>
+          <w:szCs w:val="22"/>
+        </w:rPr>
+        <w:t xml:space="preserve">Credits deducted by footage duration processed</w:t>
+      </w:r>
+    </w:p>
+    <w:p>
+      <w:pPr>
+        <w:spacing w:after="40" w:before="40"/>
+        <w:ind w:left="431"/>
+      </w:pPr>
+      <w:r>
+        <w:rPr>
+          <w:b/>
+          <w:bCs/>
+          <w:color w:val="00C9A7"/>
+          <w:sz w:val="22"/>
+          <w:szCs w:val="22"/>
+        </w:rPr>
+        <w:t xml:space="preserve">✓  </w:t>
+      </w:r>
+      <w:r>
+        <w:rPr>
+          <w:color w:val="4B5563"/>
+          <w:sz w:val="22"/>
+          <w:szCs w:val="22"/>
+        </w:rPr>
+        <w:t xml:space="preserve">Lower effective rate vs. pay-per-job</w:t>
+      </w:r>
+    </w:p>
+    <w:p>
+      <w:pPr>
+        <w:spacing w:after="40" w:before="40"/>
+        <w:ind w:left="431"/>
+      </w:pPr>
+      <w:r>
+        <w:rPr>
+          <w:b/>
+          <w:bCs/>
+          <w:color w:val="00C9A7"/>
+          <w:sz w:val="22"/>
+          <w:szCs w:val="22"/>
+        </w:rPr>
+        <w:t xml:space="preserve">✓  </w:t>
+      </w:r>
+      <w:r>
+        <w:rPr>
+          <w:color w:val="4B5563"/>
+          <w:sz w:val="22"/>
+          <w:szCs w:val="22"/>
+        </w:rPr>
+        <w:t xml:space="preserve">Full analytics report &amp; annotated video per job</w:t>
+      </w:r>
+    </w:p>
+    <w:p>
+      <w:pPr>
+        <w:spacing w:after="40" w:before="40"/>
+        <w:ind w:left="431"/>
+      </w:pPr>
+      <w:r>
+        <w:rPr>
+          <w:b/>
+          <w:bCs/>
+          <w:color w:val="00C9A7"/>
+          <w:sz w:val="22"/>
+          <w:szCs w:val="22"/>
+        </w:rPr>
+        <w:t xml:space="preserve">✓  </w:t>
+      </w:r>
+      <w:r>
+        <w:rPr>
+          <w:color w:val="4B5563"/>
+          <w:sz w:val="22"/>
+          <w:szCs w:val="22"/>
+        </w:rPr>
+        <w:t xml:space="preserve">Real-time credit balance visible on dashboard</w:t>
+      </w:r>
+    </w:p>
+    <w:p>
+      <w:pPr>
+        <w:spacing w:after="40" w:before="40"/>
+        <w:ind w:left="431"/>
+      </w:pPr>
+      <w:r>
+        <w:rPr>
+          <w:b/>
+          <w:bCs/>
+          <w:color w:val="00C9A7"/>
+          <w:sz w:val="22"/>
+          <w:szCs w:val="22"/>
+        </w:rPr>
+        <w:t xml:space="preserve">✓  </w:t>
+      </w:r>
+      <w:r>
+        <w:rPr>
+          <w:color w:val="4B5563"/>
+          <w:sz w:val="22"/>
+          <w:szCs w:val="22"/>
+        </w:rPr>
+        <w:t xml:space="preserve">Top-up at any time in 100-hour increments</w:t>
+      </w:r>
+    </w:p>
+    <w:p>
+      <w:pPr>
+        <w:spacing w:after="40" w:before="40"/>
+        <w:ind w:left="431"/>
+      </w:pPr>
+      <w:r>
+        <w:rPr>
+          <w:b/>
+          <w:bCs/>
+          <w:color w:val="00C9A7"/>
+          <w:sz w:val="22"/>
+          <w:szCs w:val="22"/>
+        </w:rPr>
+        <w:t xml:space="preserve">✓  </w:t>
+      </w:r>
+      <w:r>
+        <w:rPr>
+          <w:color w:val="4B5563"/>
+          <w:sz w:val="22"/>
+          <w:szCs w:val="22"/>
+        </w:rPr>
+        <w:t xml:space="preserve">Unused credits roll over — no expiry</w:t>
       </w:r>
     </w:p>
     <w:p>
@@ -3039,8 +3024,7 @@
       <w:tr>
         <w:tc>
           <w:tcPr>
-            <w:tcW w:type="pct" w:w="28%"/>
-            <w:gridSpan w:val="1"/>
+            <w:tcW w:type="pct" w:w="33%"/>
             <w:shd w:fill="0D1B2A" w:val="clear"/>
             <w:tcMar>
               <w:top w:type="dxa" w:w="80"/>
@@ -3058,14 +3042,13 @@
                 <w:sz w:val="20"/>
                 <w:szCs w:val="20"/>
               </w:rPr>
-              <w:t xml:space="preserve">Service</w:t>
-            </w:r>
-          </w:p>
-        </w:tc>
-        <w:tc>
-          <w:tcPr>
-            <w:tcW w:type="pct" w:w="52%"/>
-            <w:gridSpan w:val="1"/>
+              <w:t xml:space="preserve">Minimum Block</w:t>
+            </w:r>
+          </w:p>
+        </w:tc>
+        <w:tc>
+          <w:tcPr>
+            <w:tcW w:type="pct" w:w="33%"/>
             <w:shd w:fill="0D1B2A" w:val="clear"/>
             <w:tcMar>
               <w:top w:type="dxa" w:w="80"/>
@@ -3083,14 +3066,13 @@
                 <w:sz w:val="20"/>
                 <w:szCs w:val="20"/>
               </w:rPr>
-              <w:t xml:space="preserve">Description</w:t>
-            </w:r>
-          </w:p>
-        </w:tc>
-        <w:tc>
-          <w:tcPr>
-            <w:tcW w:type="pct" w:w="20%"/>
-            <w:gridSpan w:val="1"/>
+              <w:t xml:space="preserve">Rate per Hour</w:t>
+            </w:r>
+          </w:p>
+        </w:tc>
+        <w:tc>
+          <w:tcPr>
+            <w:tcW w:type="pct" w:w="34%"/>
             <w:shd w:fill="0D1B2A" w:val="clear"/>
             <w:tcMar>
               <w:top w:type="dxa" w:w="80"/>
@@ -3108,7 +3090,7 @@
                 <w:sz w:val="20"/>
                 <w:szCs w:val="20"/>
               </w:rPr>
-              <w:t xml:space="preserve">Price (ZAR)</w:t>
+              <w:t xml:space="preserve">Block Total (excl. VAT)</w:t>
             </w:r>
           </w:p>
         </w:tc>
@@ -3116,389 +3098,107 @@
       <w:tr>
         <w:tc>
           <w:tcPr>
-            <w:tcW w:type="pct" w:w="28%"/>
-            <w:gridSpan w:val="1"/>
-            <w:shd w:fill="FFFFFF" w:val="clear"/>
-            <w:tcMar>
-              <w:top w:type="dxa" w:w="80"/>
-              <w:left w:type="dxa" w:w="120"/>
-              <w:bottom w:type="dxa" w:w="80"/>
-              <w:right w:type="dxa" w:w="120"/>
-            </w:tcMar>
-          </w:tcPr>
-          <w:p>
-            <w:r>
-              <w:rPr>
-                <w:b/>
-                <w:bCs/>
-                <w:color w:val="111827"/>
-                <w:sz w:val="20"/>
-                <w:szCs w:val="20"/>
-              </w:rPr>
-              <w:t xml:space="preserve">Custom Zone Configuration</w:t>
-            </w:r>
-          </w:p>
-        </w:tc>
-        <w:tc>
-          <w:tcPr>
-            <w:tcW w:type="pct" w:w="52%"/>
-            <w:gridSpan w:val="1"/>
-            <w:shd w:fill="FFFFFF" w:val="clear"/>
-            <w:tcMar>
-              <w:top w:type="dxa" w:w="80"/>
-              <w:left w:type="dxa" w:w="120"/>
-              <w:bottom w:type="dxa" w:w="80"/>
-              <w:right w:type="dxa" w:w="120"/>
-            </w:tcMar>
-          </w:tcPr>
-          <w:p>
-            <w:r>
-              <w:rPr>
-                <w:b w:val="false"/>
-                <w:bCs w:val="false"/>
-                <w:color w:val="111827"/>
-                <w:sz w:val="20"/>
-                <w:szCs w:val="20"/>
-              </w:rPr>
-              <w:t xml:space="preserve">Definition and testing of customer-specific detection zones (per camera plan)</w:t>
-            </w:r>
-          </w:p>
-        </w:tc>
-        <w:tc>
-          <w:tcPr>
-            <w:tcW w:type="pct" w:w="20%"/>
-            <w:gridSpan w:val="1"/>
-            <w:shd w:fill="FFFFFF" w:val="clear"/>
-            <w:tcMar>
-              <w:top w:type="dxa" w:w="80"/>
-              <w:left w:type="dxa" w:w="120"/>
-              <w:bottom w:type="dxa" w:w="80"/>
-              <w:right w:type="dxa" w:w="120"/>
-            </w:tcMar>
-          </w:tcPr>
-          <w:p>
-            <w:r>
-              <w:rPr>
-                <w:b w:val="false"/>
-                <w:bCs w:val="false"/>
-                <w:color w:val="111827"/>
-                <w:sz w:val="20"/>
-                <w:szCs w:val="20"/>
-              </w:rPr>
-              <w:t xml:space="preserve">[R TBD]</w:t>
-            </w:r>
-          </w:p>
-        </w:tc>
-      </w:tr>
-      <w:tr>
-        <w:tc>
-          <w:tcPr>
-            <w:tcW w:type="pct" w:w="28%"/>
-            <w:gridSpan w:val="1"/>
-            <w:shd w:fill="FFFFFF" w:val="clear"/>
-            <w:tcMar>
-              <w:top w:type="dxa" w:w="80"/>
-              <w:left w:type="dxa" w:w="120"/>
-              <w:bottom w:type="dxa" w:w="80"/>
-              <w:right w:type="dxa" w:w="120"/>
-            </w:tcMar>
-          </w:tcPr>
-          <w:p>
-            <w:r>
-              <w:rPr>
-                <w:b/>
-                <w:bCs/>
-                <w:color w:val="111827"/>
-                <w:sz w:val="20"/>
-                <w:szCs w:val="20"/>
-              </w:rPr>
-              <w:t xml:space="preserve">Model Fine-Tuning</w:t>
-            </w:r>
-          </w:p>
-        </w:tc>
-        <w:tc>
-          <w:tcPr>
-            <w:tcW w:type="pct" w:w="52%"/>
-            <w:gridSpan w:val="1"/>
-            <w:shd w:fill="FFFFFF" w:val="clear"/>
-            <w:tcMar>
-              <w:top w:type="dxa" w:w="80"/>
-              <w:left w:type="dxa" w:w="120"/>
-              <w:bottom w:type="dxa" w:w="80"/>
-              <w:right w:type="dxa" w:w="120"/>
-            </w:tcMar>
-          </w:tcPr>
-          <w:p>
-            <w:r>
-              <w:rPr>
-                <w:b w:val="false"/>
-                <w:bCs w:val="false"/>
-                <w:color w:val="111827"/>
-                <w:sz w:val="20"/>
-                <w:szCs w:val="20"/>
-              </w:rPr>
-              <w:t xml:space="preserve">Re-training YOLOv8 on customer-provided footage for improved accuracy in specific environments</w:t>
-            </w:r>
-          </w:p>
-        </w:tc>
-        <w:tc>
-          <w:tcPr>
-            <w:tcW w:type="pct" w:w="20%"/>
-            <w:gridSpan w:val="1"/>
-            <w:shd w:fill="FFFFFF" w:val="clear"/>
-            <w:tcMar>
-              <w:top w:type="dxa" w:w="80"/>
-              <w:left w:type="dxa" w:w="120"/>
-              <w:bottom w:type="dxa" w:w="80"/>
-              <w:right w:type="dxa" w:w="120"/>
-            </w:tcMar>
-          </w:tcPr>
-          <w:p>
-            <w:r>
-              <w:rPr>
-                <w:b w:val="false"/>
-                <w:bCs w:val="false"/>
-                <w:color w:val="111827"/>
-                <w:sz w:val="20"/>
-                <w:szCs w:val="20"/>
-              </w:rPr>
-              <w:t xml:space="preserve">[R TBD]</w:t>
-            </w:r>
-          </w:p>
-        </w:tc>
-      </w:tr>
-      <w:tr>
-        <w:tc>
-          <w:tcPr>
-            <w:tcW w:type="pct" w:w="28%"/>
-            <w:gridSpan w:val="1"/>
-            <w:shd w:fill="FFFFFF" w:val="clear"/>
-            <w:tcMar>
-              <w:top w:type="dxa" w:w="80"/>
-              <w:left w:type="dxa" w:w="120"/>
-              <w:bottom w:type="dxa" w:w="80"/>
-              <w:right w:type="dxa" w:w="120"/>
-            </w:tcMar>
-          </w:tcPr>
-          <w:p>
-            <w:r>
-              <w:rPr>
-                <w:b/>
-                <w:bCs/>
-                <w:color w:val="111827"/>
-                <w:sz w:val="20"/>
-                <w:szCs w:val="20"/>
-              </w:rPr>
-              <w:t xml:space="preserve">Hardware Procurement</w:t>
-            </w:r>
-          </w:p>
-        </w:tc>
-        <w:tc>
-          <w:tcPr>
-            <w:tcW w:type="pct" w:w="52%"/>
-            <w:gridSpan w:val="1"/>
-            <w:shd w:fill="FFFFFF" w:val="clear"/>
-            <w:tcMar>
-              <w:top w:type="dxa" w:w="80"/>
-              <w:left w:type="dxa" w:w="120"/>
-              <w:bottom w:type="dxa" w:w="80"/>
-              <w:right w:type="dxa" w:w="120"/>
-            </w:tcMar>
-          </w:tcPr>
-          <w:p>
-            <w:r>
-              <w:rPr>
-                <w:b w:val="false"/>
-                <w:bCs w:val="false"/>
-                <w:color w:val="111827"/>
-                <w:sz w:val="20"/>
-                <w:szCs w:val="20"/>
-              </w:rPr>
-              <w:t xml:space="preserve">Lenovo P360 Ultra + Axelera Metis M.2 card — sourced, configured, and delivered</w:t>
-            </w:r>
-          </w:p>
-        </w:tc>
-        <w:tc>
-          <w:tcPr>
-            <w:tcW w:type="pct" w:w="20%"/>
-            <w:gridSpan w:val="1"/>
-            <w:shd w:fill="FFFFFF" w:val="clear"/>
-            <w:tcMar>
-              <w:top w:type="dxa" w:w="80"/>
-              <w:left w:type="dxa" w:w="120"/>
-              <w:bottom w:type="dxa" w:w="80"/>
-              <w:right w:type="dxa" w:w="120"/>
-            </w:tcMar>
-          </w:tcPr>
-          <w:p>
-            <w:r>
-              <w:rPr>
-                <w:b w:val="false"/>
-                <w:bCs w:val="false"/>
-                <w:color w:val="111827"/>
-                <w:sz w:val="20"/>
-                <w:szCs w:val="20"/>
-              </w:rPr>
-              <w:t xml:space="preserve">At cost + margin</w:t>
-            </w:r>
-          </w:p>
-        </w:tc>
-      </w:tr>
-      <w:tr>
-        <w:tc>
-          <w:tcPr>
-            <w:tcW w:type="pct" w:w="28%"/>
-            <w:gridSpan w:val="1"/>
-            <w:shd w:fill="FFFFFF" w:val="clear"/>
-            <w:tcMar>
-              <w:top w:type="dxa" w:w="80"/>
-              <w:left w:type="dxa" w:w="120"/>
-              <w:bottom w:type="dxa" w:w="80"/>
-              <w:right w:type="dxa" w:w="120"/>
-            </w:tcMar>
-          </w:tcPr>
-          <w:p>
-            <w:r>
-              <w:rPr>
-                <w:b/>
-                <w:bCs/>
-                <w:color w:val="111827"/>
-                <w:sz w:val="20"/>
-                <w:szCs w:val="20"/>
-              </w:rPr>
-              <w:t xml:space="preserve">Annual Support Contract</w:t>
-            </w:r>
-          </w:p>
-        </w:tc>
-        <w:tc>
-          <w:tcPr>
-            <w:tcW w:type="pct" w:w="52%"/>
-            <w:gridSpan w:val="1"/>
-            <w:shd w:fill="FFFFFF" w:val="clear"/>
-            <w:tcMar>
-              <w:top w:type="dxa" w:w="80"/>
-              <w:left w:type="dxa" w:w="120"/>
-              <w:bottom w:type="dxa" w:w="80"/>
-              <w:right w:type="dxa" w:w="120"/>
-            </w:tcMar>
-          </w:tcPr>
-          <w:p>
-            <w:r>
-              <w:rPr>
-                <w:b w:val="false"/>
-                <w:bCs w:val="false"/>
-                <w:color w:val="111827"/>
-                <w:sz w:val="20"/>
-                <w:szCs w:val="20"/>
-              </w:rPr>
-              <w:t xml:space="preserve">Priority bug fixes, platform updates, remote troubleshooting — 9–5 Mon–Fri</w:t>
-            </w:r>
-          </w:p>
-        </w:tc>
-        <w:tc>
-          <w:tcPr>
-            <w:tcW w:type="pct" w:w="20%"/>
-            <w:gridSpan w:val="1"/>
-            <w:shd w:fill="FFFFFF" w:val="clear"/>
-            <w:tcMar>
-              <w:top w:type="dxa" w:w="80"/>
-              <w:left w:type="dxa" w:w="120"/>
-              <w:bottom w:type="dxa" w:w="80"/>
-              <w:right w:type="dxa" w:w="120"/>
-            </w:tcMar>
-          </w:tcPr>
-          <w:p>
-            <w:r>
-              <w:rPr>
-                <w:b w:val="false"/>
-                <w:bCs w:val="false"/>
-                <w:color w:val="111827"/>
-                <w:sz w:val="20"/>
-                <w:szCs w:val="20"/>
-              </w:rPr>
-              <w:t xml:space="preserve">[R TBD / year]</w:t>
-            </w:r>
-          </w:p>
-        </w:tc>
-      </w:tr>
-      <w:tr>
-        <w:tc>
-          <w:tcPr>
-            <w:tcW w:type="pct" w:w="28%"/>
-            <w:gridSpan w:val="1"/>
-            <w:shd w:fill="FFFFFF" w:val="clear"/>
-            <w:tcMar>
-              <w:top w:type="dxa" w:w="80"/>
-              <w:left w:type="dxa" w:w="120"/>
-              <w:bottom w:type="dxa" w:w="80"/>
-              <w:right w:type="dxa" w:w="120"/>
-            </w:tcMar>
-          </w:tcPr>
-          <w:p>
-            <w:r>
-              <w:rPr>
-                <w:b/>
-                <w:bCs/>
-                <w:color w:val="111827"/>
-                <w:sz w:val="20"/>
-                <w:szCs w:val="20"/>
-              </w:rPr>
-              <w:t xml:space="preserve">Additional Training Session</w:t>
-            </w:r>
-          </w:p>
-        </w:tc>
-        <w:tc>
-          <w:tcPr>
-            <w:tcW w:type="pct" w:w="52%"/>
-            <w:gridSpan w:val="1"/>
-            <w:shd w:fill="FFFFFF" w:val="clear"/>
-            <w:tcMar>
-              <w:top w:type="dxa" w:w="80"/>
-              <w:left w:type="dxa" w:w="120"/>
-              <w:bottom w:type="dxa" w:w="80"/>
-              <w:right w:type="dxa" w:w="120"/>
-            </w:tcMar>
-          </w:tcPr>
-          <w:p>
-            <w:r>
-              <w:rPr>
-                <w:b w:val="false"/>
-                <w:bCs w:val="false"/>
-                <w:color w:val="111827"/>
-                <w:sz w:val="20"/>
-                <w:szCs w:val="20"/>
-              </w:rPr>
-              <w:t xml:space="preserve">Half-day on-site or remote session for new staff members</w:t>
-            </w:r>
-          </w:p>
-        </w:tc>
-        <w:tc>
-          <w:tcPr>
-            <w:tcW w:type="pct" w:w="20%"/>
-            <w:gridSpan w:val="1"/>
-            <w:shd w:fill="FFFFFF" w:val="clear"/>
-            <w:tcMar>
-              <w:top w:type="dxa" w:w="80"/>
-              <w:left w:type="dxa" w:w="120"/>
-              <w:bottom w:type="dxa" w:w="80"/>
-              <w:right w:type="dxa" w:w="120"/>
-            </w:tcMar>
-          </w:tcPr>
-          <w:p>
-            <w:r>
-              <w:rPr>
-                <w:b w:val="false"/>
-                <w:bCs w:val="false"/>
-                <w:color w:val="111827"/>
-                <w:sz w:val="20"/>
-                <w:szCs w:val="20"/>
-              </w:rPr>
-              <w:t xml:space="preserve">[R TBD]</w:t>
+            <w:tcW w:type="pct" w:w="33%"/>
+            <w:shd w:fill="F8F9FB" w:val="clear"/>
+            <w:tcMar>
+              <w:top w:type="dxa" w:w="140"/>
+              <w:left w:type="dxa" w:w="160"/>
+              <w:bottom w:type="dxa" w:w="140"/>
+              <w:right w:type="dxa" w:w="160"/>
+            </w:tcMar>
+          </w:tcPr>
+          <w:p>
+            <w:pPr>
+              <w:jc w:val="center"/>
+            </w:pPr>
+            <w:r>
+              <w:rPr>
+                <w:b/>
+                <w:bCs/>
+                <w:color w:val="0D1B2A"/>
+                <w:sz w:val="28"/>
+                <w:szCs w:val="28"/>
+              </w:rPr>
+              <w:t xml:space="preserve">100 hours</w:t>
+            </w:r>
+          </w:p>
+        </w:tc>
+        <w:tc>
+          <w:tcPr>
+            <w:tcW w:type="pct" w:w="33%"/>
+            <w:shd w:fill="F8F9FB" w:val="clear"/>
+            <w:tcMar>
+              <w:top w:type="dxa" w:w="140"/>
+              <w:left w:type="dxa" w:w="160"/>
+              <w:bottom w:type="dxa" w:w="140"/>
+              <w:right w:type="dxa" w:w="160"/>
+            </w:tcMar>
+          </w:tcPr>
+          <w:p>
+            <w:pPr>
+              <w:jc w:val="center"/>
+            </w:pPr>
+            <w:r>
+              <w:rPr>
+                <w:b/>
+                <w:bCs/>
+                <w:color w:val="00C9A7"/>
+                <w:sz w:val="28"/>
+                <w:szCs w:val="28"/>
+              </w:rPr>
+              <w:t xml:space="preserve">R 225</w:t>
+            </w:r>
+          </w:p>
+        </w:tc>
+        <w:tc>
+          <w:tcPr>
+            <w:tcW w:type="pct" w:w="34%"/>
+            <w:shd w:fill="F8F9FB" w:val="clear"/>
+            <w:tcMar>
+              <w:top w:type="dxa" w:w="140"/>
+              <w:left w:type="dxa" w:w="160"/>
+              <w:bottom w:type="dxa" w:w="140"/>
+              <w:right w:type="dxa" w:w="160"/>
+            </w:tcMar>
+          </w:tcPr>
+          <w:p>
+            <w:pPr>
+              <w:jc w:val="center"/>
+            </w:pPr>
+            <w:r>
+              <w:rPr>
+                <w:b/>
+                <w:bCs/>
+                <w:color w:val="0D1B2A"/>
+                <w:sz w:val="28"/>
+                <w:szCs w:val="28"/>
+              </w:rPr>
+              <w:t xml:space="preserve">R 22,500</w:t>
             </w:r>
           </w:p>
         </w:tc>
       </w:tr>
     </w:tbl>
+    <w:p>
+      <w:pPr>
+        <w:spacing w:after="0" w:before="0"/>
+      </w:pPr>
+    </w:p>
+    <w:p>
+      <w:pPr>
+        <w:spacing w:after="80" w:before="60"/>
+      </w:pPr>
+      <w:r>
+        <w:rPr>
+          <w:i/>
+          <w:iCs/>
+          <w:color w:val="9CA3AF"/>
+          <w:sz w:val="18"/>
+          <w:szCs w:val="18"/>
+        </w:rPr>
+        <w:t xml:space="preserve">All prices are in South African Rand (ZAR) and exclude VAT at the prevailing rate. Hardware procurement is quoted separately.</w:t>
+      </w:r>
+    </w:p>
     <w:p>
       <w:r>
         <w:br w:type="page"/>
@@ -3517,18 +3217,511 @@
           <w:sz w:val="18"/>
           <w:szCs w:val="18"/>
         </w:rPr>
-        <w:t xml:space="preserve">GETTING STARTED</w:t>
+        <w:t xml:space="preserve">OPTIONAL</w:t>
       </w:r>
     </w:p>
     <w:p>
       <w:pPr>
         <w:pStyle w:val="Heading1"/>
         <w:spacing w:after="120" w:before="400"/>
+      </w:pPr>
+      <w:r>
+        <w:t xml:space="preserve">Add-On Services</w:t>
+      </w:r>
+    </w:p>
+    <w:p>
+      <w:pPr>
+        <w:spacing w:after="0" w:before="0"/>
+      </w:pPr>
+    </w:p>
+    <w:tbl>
+      <w:tblPr>
+        <w:tblW w:type="pct" w:w="100%"/>
+        <w:tblBorders>
+          <w:top w:val="single" w:color="auto" w:sz="4"/>
+          <w:left w:val="single" w:color="auto" w:sz="4"/>
+          <w:bottom w:val="single" w:color="auto" w:sz="4"/>
+          <w:right w:val="single" w:color="auto" w:sz="4"/>
+          <w:insideH w:val="single" w:color="auto" w:sz="4"/>
+          <w:insideV w:val="single" w:color="auto" w:sz="4"/>
+        </w:tblBorders>
+        <w:tblLayout w:type="fixed"/>
+      </w:tblPr>
+      <w:tblGrid>
+        <w:gridCol w:w="100"/>
+        <w:gridCol w:w="100"/>
+        <w:gridCol w:w="100"/>
+      </w:tblGrid>
+      <w:tr>
+        <w:tc>
+          <w:tcPr>
+            <w:tcW w:type="pct" w:w="28%"/>
+            <w:shd w:fill="0D1B2A" w:val="clear"/>
+            <w:tcMar>
+              <w:top w:type="dxa" w:w="80"/>
+              <w:left w:type="dxa" w:w="120"/>
+              <w:bottom w:type="dxa" w:w="80"/>
+              <w:right w:type="dxa" w:w="120"/>
+            </w:tcMar>
+          </w:tcPr>
+          <w:p>
+            <w:r>
+              <w:rPr>
+                <w:b/>
+                <w:bCs/>
+                <w:color w:val="FFFFFF"/>
+                <w:sz w:val="20"/>
+                <w:szCs w:val="20"/>
+              </w:rPr>
+              <w:t xml:space="preserve">Service</w:t>
+            </w:r>
+          </w:p>
+        </w:tc>
+        <w:tc>
+          <w:tcPr>
+            <w:tcW w:type="pct" w:w="52%"/>
+            <w:shd w:fill="0D1B2A" w:val="clear"/>
+            <w:tcMar>
+              <w:top w:type="dxa" w:w="80"/>
+              <w:left w:type="dxa" w:w="120"/>
+              <w:bottom w:type="dxa" w:w="80"/>
+              <w:right w:type="dxa" w:w="120"/>
+            </w:tcMar>
+          </w:tcPr>
+          <w:p>
+            <w:r>
+              <w:rPr>
+                <w:b/>
+                <w:bCs/>
+                <w:color w:val="FFFFFF"/>
+                <w:sz w:val="20"/>
+                <w:szCs w:val="20"/>
+              </w:rPr>
+              <w:t xml:space="preserve">Description</w:t>
+            </w:r>
+          </w:p>
+        </w:tc>
+        <w:tc>
+          <w:tcPr>
+            <w:tcW w:type="pct" w:w="20%"/>
+            <w:shd w:fill="0D1B2A" w:val="clear"/>
+            <w:tcMar>
+              <w:top w:type="dxa" w:w="80"/>
+              <w:left w:type="dxa" w:w="120"/>
+              <w:bottom w:type="dxa" w:w="80"/>
+              <w:right w:type="dxa" w:w="120"/>
+            </w:tcMar>
+          </w:tcPr>
+          <w:p>
+            <w:r>
+              <w:rPr>
+                <w:b/>
+                <w:bCs/>
+                <w:color w:val="FFFFFF"/>
+                <w:sz w:val="20"/>
+                <w:szCs w:val="20"/>
+              </w:rPr>
+              <w:t xml:space="preserve">Price (ZAR)</w:t>
+            </w:r>
+          </w:p>
+        </w:tc>
+      </w:tr>
+      <w:tr>
+        <w:tc>
+          <w:tcPr>
+            <w:tcW w:type="pct" w:w="28%"/>
+            <w:shd w:fill="FFFFFF" w:val="clear"/>
+            <w:tcMar>
+              <w:top w:type="dxa" w:w="80"/>
+              <w:left w:type="dxa" w:w="120"/>
+              <w:bottom w:type="dxa" w:w="80"/>
+              <w:right w:type="dxa" w:w="120"/>
+            </w:tcMar>
+          </w:tcPr>
+          <w:p>
+            <w:r>
+              <w:rPr>
+                <w:b/>
+                <w:bCs/>
+                <w:color w:val="111827"/>
+                <w:sz w:val="20"/>
+                <w:szCs w:val="20"/>
+              </w:rPr>
+              <w:t xml:space="preserve">Custom Zone Configuration</w:t>
+            </w:r>
+          </w:p>
+        </w:tc>
+        <w:tc>
+          <w:tcPr>
+            <w:tcW w:type="pct" w:w="52%"/>
+            <w:shd w:fill="FFFFFF" w:val="clear"/>
+            <w:tcMar>
+              <w:top w:type="dxa" w:w="80"/>
+              <w:left w:type="dxa" w:w="120"/>
+              <w:bottom w:type="dxa" w:w="80"/>
+              <w:right w:type="dxa" w:w="120"/>
+            </w:tcMar>
+          </w:tcPr>
+          <w:p>
+            <w:r>
+              <w:rPr>
+                <w:b w:val="false"/>
+                <w:bCs w:val="false"/>
+                <w:color w:val="111827"/>
+                <w:sz w:val="20"/>
+                <w:szCs w:val="20"/>
+              </w:rPr>
+              <w:t xml:space="preserve">Definition and testing of customer-specific detection zones (per camera plan)</w:t>
+            </w:r>
+          </w:p>
+        </w:tc>
+        <w:tc>
+          <w:tcPr>
+            <w:tcW w:type="pct" w:w="20%"/>
+            <w:shd w:fill="FFFFFF" w:val="clear"/>
+            <w:tcMar>
+              <w:top w:type="dxa" w:w="80"/>
+              <w:left w:type="dxa" w:w="120"/>
+              <w:bottom w:type="dxa" w:w="80"/>
+              <w:right w:type="dxa" w:w="120"/>
+            </w:tcMar>
+          </w:tcPr>
+          <w:p>
+            <w:r>
+              <w:rPr>
+                <w:b w:val="false"/>
+                <w:bCs w:val="false"/>
+                <w:color w:val="111827"/>
+                <w:sz w:val="20"/>
+                <w:szCs w:val="20"/>
+              </w:rPr>
+              <w:t xml:space="preserve">[R TBD]</w:t>
+            </w:r>
+          </w:p>
+        </w:tc>
+      </w:tr>
+      <w:tr>
+        <w:tc>
+          <w:tcPr>
+            <w:tcW w:type="pct" w:w="28%"/>
+            <w:shd w:fill="FFFFFF" w:val="clear"/>
+            <w:tcMar>
+              <w:top w:type="dxa" w:w="80"/>
+              <w:left w:type="dxa" w:w="120"/>
+              <w:bottom w:type="dxa" w:w="80"/>
+              <w:right w:type="dxa" w:w="120"/>
+            </w:tcMar>
+          </w:tcPr>
+          <w:p>
+            <w:r>
+              <w:rPr>
+                <w:b/>
+                <w:bCs/>
+                <w:color w:val="111827"/>
+                <w:sz w:val="20"/>
+                <w:szCs w:val="20"/>
+              </w:rPr>
+              <w:t xml:space="preserve">Model Fine-Tuning</w:t>
+            </w:r>
+          </w:p>
+        </w:tc>
+        <w:tc>
+          <w:tcPr>
+            <w:tcW w:type="pct" w:w="52%"/>
+            <w:shd w:fill="FFFFFF" w:val="clear"/>
+            <w:tcMar>
+              <w:top w:type="dxa" w:w="80"/>
+              <w:left w:type="dxa" w:w="120"/>
+              <w:bottom w:type="dxa" w:w="80"/>
+              <w:right w:type="dxa" w:w="120"/>
+            </w:tcMar>
+          </w:tcPr>
+          <w:p>
+            <w:r>
+              <w:rPr>
+                <w:b w:val="false"/>
+                <w:bCs w:val="false"/>
+                <w:color w:val="111827"/>
+                <w:sz w:val="20"/>
+                <w:szCs w:val="20"/>
+              </w:rPr>
+              <w:t xml:space="preserve">Re-training YOLOv8 on customer-provided footage for improved accuracy in specific environments</w:t>
+            </w:r>
+          </w:p>
+        </w:tc>
+        <w:tc>
+          <w:tcPr>
+            <w:tcW w:type="pct" w:w="20%"/>
+            <w:shd w:fill="FFFFFF" w:val="clear"/>
+            <w:tcMar>
+              <w:top w:type="dxa" w:w="80"/>
+              <w:left w:type="dxa" w:w="120"/>
+              <w:bottom w:type="dxa" w:w="80"/>
+              <w:right w:type="dxa" w:w="120"/>
+            </w:tcMar>
+          </w:tcPr>
+          <w:p>
+            <w:r>
+              <w:rPr>
+                <w:b w:val="false"/>
+                <w:bCs w:val="false"/>
+                <w:color w:val="111827"/>
+                <w:sz w:val="20"/>
+                <w:szCs w:val="20"/>
+              </w:rPr>
+              <w:t xml:space="preserve">[R TBD]</w:t>
+            </w:r>
+          </w:p>
+        </w:tc>
+      </w:tr>
+      <w:tr>
+        <w:tc>
+          <w:tcPr>
+            <w:tcW w:type="pct" w:w="28%"/>
+            <w:shd w:fill="FFFFFF" w:val="clear"/>
+            <w:tcMar>
+              <w:top w:type="dxa" w:w="80"/>
+              <w:left w:type="dxa" w:w="120"/>
+              <w:bottom w:type="dxa" w:w="80"/>
+              <w:right w:type="dxa" w:w="120"/>
+            </w:tcMar>
+          </w:tcPr>
+          <w:p>
+            <w:r>
+              <w:rPr>
+                <w:b/>
+                <w:bCs/>
+                <w:color w:val="111827"/>
+                <w:sz w:val="20"/>
+                <w:szCs w:val="20"/>
+              </w:rPr>
+              <w:t xml:space="preserve">Hardware Procurement</w:t>
+            </w:r>
+          </w:p>
+        </w:tc>
+        <w:tc>
+          <w:tcPr>
+            <w:tcW w:type="pct" w:w="52%"/>
+            <w:shd w:fill="FFFFFF" w:val="clear"/>
+            <w:tcMar>
+              <w:top w:type="dxa" w:w="80"/>
+              <w:left w:type="dxa" w:w="120"/>
+              <w:bottom w:type="dxa" w:w="80"/>
+              <w:right w:type="dxa" w:w="120"/>
+            </w:tcMar>
+          </w:tcPr>
+          <w:p>
+            <w:r>
+              <w:rPr>
+                <w:b w:val="false"/>
+                <w:bCs w:val="false"/>
+                <w:color w:val="111827"/>
+                <w:sz w:val="20"/>
+                <w:szCs w:val="20"/>
+              </w:rPr>
+              <w:t xml:space="preserve">Lenovo P360 Ultra + Axelera Metis M.2 card — sourced, configured, and delivered</w:t>
+            </w:r>
+          </w:p>
+        </w:tc>
+        <w:tc>
+          <w:tcPr>
+            <w:tcW w:type="pct" w:w="20%"/>
+            <w:shd w:fill="FFFFFF" w:val="clear"/>
+            <w:tcMar>
+              <w:top w:type="dxa" w:w="80"/>
+              <w:left w:type="dxa" w:w="120"/>
+              <w:bottom w:type="dxa" w:w="80"/>
+              <w:right w:type="dxa" w:w="120"/>
+            </w:tcMar>
+          </w:tcPr>
+          <w:p>
+            <w:r>
+              <w:rPr>
+                <w:b w:val="false"/>
+                <w:bCs w:val="false"/>
+                <w:color w:val="111827"/>
+                <w:sz w:val="20"/>
+                <w:szCs w:val="20"/>
+              </w:rPr>
+              <w:t xml:space="preserve">At cost + margin</w:t>
+            </w:r>
+          </w:p>
+        </w:tc>
+      </w:tr>
+      <w:tr>
+        <w:tc>
+          <w:tcPr>
+            <w:tcW w:type="pct" w:w="28%"/>
+            <w:shd w:fill="FFFFFF" w:val="clear"/>
+            <w:tcMar>
+              <w:top w:type="dxa" w:w="80"/>
+              <w:left w:type="dxa" w:w="120"/>
+              <w:bottom w:type="dxa" w:w="80"/>
+              <w:right w:type="dxa" w:w="120"/>
+            </w:tcMar>
+          </w:tcPr>
+          <w:p>
+            <w:r>
+              <w:rPr>
+                <w:b/>
+                <w:bCs/>
+                <w:color w:val="111827"/>
+                <w:sz w:val="20"/>
+                <w:szCs w:val="20"/>
+              </w:rPr>
+              <w:t xml:space="preserve">Annual Support Contract</w:t>
+            </w:r>
+          </w:p>
+        </w:tc>
+        <w:tc>
+          <w:tcPr>
+            <w:tcW w:type="pct" w:w="52%"/>
+            <w:shd w:fill="FFFFFF" w:val="clear"/>
+            <w:tcMar>
+              <w:top w:type="dxa" w:w="80"/>
+              <w:left w:type="dxa" w:w="120"/>
+              <w:bottom w:type="dxa" w:w="80"/>
+              <w:right w:type="dxa" w:w="120"/>
+            </w:tcMar>
+          </w:tcPr>
+          <w:p>
+            <w:r>
+              <w:rPr>
+                <w:b w:val="false"/>
+                <w:bCs w:val="false"/>
+                <w:color w:val="111827"/>
+                <w:sz w:val="20"/>
+                <w:szCs w:val="20"/>
+              </w:rPr>
+              <w:t xml:space="preserve">Priority bug fixes, platform updates, remote troubleshooting — 9–5 Mon–Fri</w:t>
+            </w:r>
+          </w:p>
+        </w:tc>
+        <w:tc>
+          <w:tcPr>
+            <w:tcW w:type="pct" w:w="20%"/>
+            <w:shd w:fill="FFFFFF" w:val="clear"/>
+            <w:tcMar>
+              <w:top w:type="dxa" w:w="80"/>
+              <w:left w:type="dxa" w:w="120"/>
+              <w:bottom w:type="dxa" w:w="80"/>
+              <w:right w:type="dxa" w:w="120"/>
+            </w:tcMar>
+          </w:tcPr>
+          <w:p>
+            <w:r>
+              <w:rPr>
+                <w:b w:val="false"/>
+                <w:bCs w:val="false"/>
+                <w:color w:val="111827"/>
+                <w:sz w:val="20"/>
+                <w:szCs w:val="20"/>
+              </w:rPr>
+              <w:t xml:space="preserve">[R TBD / year]</w:t>
+            </w:r>
+          </w:p>
+        </w:tc>
+      </w:tr>
+      <w:tr>
+        <w:tc>
+          <w:tcPr>
+            <w:tcW w:type="pct" w:w="28%"/>
+            <w:shd w:fill="FFFFFF" w:val="clear"/>
+            <w:tcMar>
+              <w:top w:type="dxa" w:w="80"/>
+              <w:left w:type="dxa" w:w="120"/>
+              <w:bottom w:type="dxa" w:w="80"/>
+              <w:right w:type="dxa" w:w="120"/>
+            </w:tcMar>
+          </w:tcPr>
+          <w:p>
+            <w:r>
+              <w:rPr>
+                <w:b/>
+                <w:bCs/>
+                <w:color w:val="111827"/>
+                <w:sz w:val="20"/>
+                <w:szCs w:val="20"/>
+              </w:rPr>
+              <w:t xml:space="preserve">Additional Training Session</w:t>
+            </w:r>
+          </w:p>
+        </w:tc>
+        <w:tc>
+          <w:tcPr>
+            <w:tcW w:type="pct" w:w="52%"/>
+            <w:shd w:fill="FFFFFF" w:val="clear"/>
+            <w:tcMar>
+              <w:top w:type="dxa" w:w="80"/>
+              <w:left w:type="dxa" w:w="120"/>
+              <w:bottom w:type="dxa" w:w="80"/>
+              <w:right w:type="dxa" w:w="120"/>
+            </w:tcMar>
+          </w:tcPr>
+          <w:p>
+            <w:r>
+              <w:rPr>
+                <w:b w:val="false"/>
+                <w:bCs w:val="false"/>
+                <w:color w:val="111827"/>
+                <w:sz w:val="20"/>
+                <w:szCs w:val="20"/>
+              </w:rPr>
+              <w:t xml:space="preserve">Half-day on-site or remote session for new staff members</w:t>
+            </w:r>
+          </w:p>
+        </w:tc>
+        <w:tc>
+          <w:tcPr>
+            <w:tcW w:type="pct" w:w="20%"/>
+            <w:shd w:fill="FFFFFF" w:val="clear"/>
+            <w:tcMar>
+              <w:top w:type="dxa" w:w="80"/>
+              <w:left w:type="dxa" w:w="120"/>
+              <w:bottom w:type="dxa" w:w="80"/>
+              <w:right w:type="dxa" w:w="120"/>
+            </w:tcMar>
+          </w:tcPr>
+          <w:p>
+            <w:r>
+              <w:rPr>
+                <w:b w:val="false"/>
+                <w:bCs w:val="false"/>
+                <w:color w:val="111827"/>
+                <w:sz w:val="20"/>
+                <w:szCs w:val="20"/>
+              </w:rPr>
+              <w:t xml:space="preserve">[R TBD]</w:t>
+            </w:r>
+          </w:p>
+        </w:tc>
+      </w:tr>
+    </w:tbl>
+    <w:p>
+      <w:r>
+        <w:br w:type="page"/>
+      </w:r>
+    </w:p>
+    <w:p>
+      <w:pPr>
+        <w:spacing w:after="60" w:before="200"/>
+      </w:pPr>
+      <w:r>
         <w:rPr>
           <w:b/>
           <w:bCs/>
-          <w:color w:val="0D1B2A"/>
-        </w:rPr>
+          <w:color w:val="1A56DB"/>
+          <w:spacing w:val="60"/>
+          <w:sz w:val="18"/>
+          <w:szCs w:val="18"/>
+        </w:rPr>
+        <w:t xml:space="preserve">GETTING STARTED</w:t>
+      </w:r>
+    </w:p>
+    <w:p>
+      <w:pPr>
+        <w:pStyle w:val="Heading1"/>
+        <w:spacing w:after="120" w:before="400"/>
       </w:pPr>
       <w:r>
         <w:t xml:space="preserve">Next Steps</w:t>
@@ -3750,11 +3943,6 @@
       <w:pPr>
         <w:pStyle w:val="Heading1"/>
         <w:spacing w:after="120" w:before="400"/>
-        <w:rPr>
-          <w:b/>
-          <w:bCs/>
-          <w:color w:val="0D1B2A"/>
-        </w:rPr>
       </w:pPr>
       <w:r>
         <w:t xml:space="preserve">Get In Touch</w:t>

</xml_diff>

<commit_message>
Update proposal details with client, contact, and timeline information
Update client name to ABC Media, contact email to info@visiontrack.co.za, and delivery timeline to 1 day in the proposal documents.

Replit-Commit-Author: Agent
Replit-Commit-Session-Id: e5be5380-7ed6-464d-a7de-b2f0af8d3ecf
Replit-Commit-Checkpoint-Type: full_checkpoint
Replit-Commit-Event-Id: 164d9c01-b0b1-4945-97ac-0dc6db7f9bcc
Replit-Commit-Screenshot-Url: https://storage.googleapis.com/screenshot-production-us-central1/40005695-766b-4df9-801e-05785cb39d6d/e5be5380-7ed6-464d-a7de-b2f0af8d3ecf/ZcJQ5xo
Replit-Helium-Checkpoint-Created: true
</commit_message>
<xml_diff>
--- a/VisionTrack-Proposal.docx
+++ b/VisionTrack-Proposal.docx
@@ -114,7 +114,7 @@
                 <w:sz w:val="22"/>
                 <w:szCs w:val="22"/>
               </w:rPr>
-              <w:t xml:space="preserve">[Client Name]</w:t>
+              <w:t xml:space="preserve">ABC Media</w:t>
             </w:r>
           </w:p>
         </w:tc>
@@ -1273,7 +1273,7 @@
           <w:sz w:val="22"/>
           <w:szCs w:val="22"/>
         </w:rPr>
-        <w:t xml:space="preserve">Define custom polygon zones — entrances, car parks, restricted areas — and the system automatically classifies every detection into the correct zone using a ray-casting algorithm.</w:t>
+        <w:t xml:space="preserve">Define custom polygon zones — entrances, car parks, restricted areas — and the system automatically classifies every detection into the correct zone.</w:t>
       </w:r>
     </w:p>
     <w:p>
@@ -3907,7 +3907,7 @@
                 <w:sz w:val="18"/>
                 <w:szCs w:val="18"/>
               </w:rPr>
-              <w:t xml:space="preserve">Installation, configuration, and handover — typically completed within [X] days of project kickoff.</w:t>
+              <w:t xml:space="preserve">Installation, configuration, and handover — typically completed within 1 day of project kickoff.</w:t>
             </w:r>
           </w:p>
         </w:tc>
@@ -4085,7 +4085,7 @@
                 <w:sz w:val="20"/>
                 <w:szCs w:val="20"/>
               </w:rPr>
-              <w:t xml:space="preserve">[your@email.com]</w:t>
+              <w:t xml:space="preserve">info@visiontrack.co.za</w:t>
             </w:r>
           </w:p>
           <w:p>

</xml_diff>